<commit_message>
Final version: POUO1–POUO4 implemented, reports and methodology ready
Co-authored-by: Cursor <cursoragent@cursor.com>
</commit_message>
<xml_diff>
--- a/app/report/templates/templatePOUO3.docx
+++ b/app/report/templates/templatePOUO3.docx
@@ -15,8 +15,7 @@
           <w:lang w:eastAsia="ru-RU"/>
         </w:rPr>
       </w:pPr>
-      <w:bookmarkStart w:id="0" w:name="_GoBack"/>
-      <w:bookmarkEnd w:id="0"/>
+      <w:proofErr w:type="gramStart"/>
       <w:r>
         <w:rPr>
           <w:rFonts w:cs="Times New Roman"/>
@@ -24,7 +23,17 @@
           <w:sz w:val="24"/>
           <w:szCs w:val="24"/>
         </w:rPr>
-        <w:t>8.1  Расчёт параметров волны давления при разрыве газопровода в замкнутом пространстве</w:t>
+        <w:t>8.1  Расчёт</w:t>
+      </w:r>
+      <w:proofErr w:type="gramEnd"/>
+      <w:r>
+        <w:rPr>
+          <w:rFonts w:cs="Times New Roman"/>
+          <w:b/>
+          <w:sz w:val="24"/>
+          <w:szCs w:val="24"/>
+        </w:rPr>
+        <w:t xml:space="preserve"> параметров волны давления при разрыве газопровода в замкнутом пространстве</w:t>
       </w:r>
     </w:p>
     <w:p>
@@ -976,7 +985,25 @@
           <w:sz w:val="24"/>
           <w:szCs w:val="24"/>
         </w:rPr>
-        <w:t>Массовый секундный расход газа М из газопровода для критического режима истечения, когда основные его параметры (расход и скорость истечения) зависят только от параметров разгерметизированного трубопровода, может быть определен по формуле</w:t>
+        <w:t xml:space="preserve">Массовый секундный расход газа М из газопровода для критического режима истечения, когда основные его параметры (расход и скорость истечения) зависят только от параметров </w:t>
+      </w:r>
+      <w:proofErr w:type="spellStart"/>
+      <w:r>
+        <w:rPr>
+          <w:rFonts w:cs="Times New Roman"/>
+          <w:sz w:val="24"/>
+          <w:szCs w:val="24"/>
+        </w:rPr>
+        <w:t>разгерметизированного</w:t>
+      </w:r>
+      <w:proofErr w:type="spellEnd"/>
+      <w:r>
+        <w:rPr>
+          <w:rFonts w:cs="Times New Roman"/>
+          <w:sz w:val="24"/>
+          <w:szCs w:val="24"/>
+        </w:rPr>
+        <w:t xml:space="preserve"> трубопровода, может быть определен по формуле</w:t>
       </w:r>
     </w:p>
     <w:p>
@@ -1020,7 +1047,16 @@
           <w:sz w:val="24"/>
           <w:szCs w:val="24"/>
         </w:rPr>
-        <w:t xml:space="preserve"> × µ × (Р</w:t>
+        <w:t xml:space="preserve"> × µ × (</w:t>
+      </w:r>
+      <w:proofErr w:type="spellStart"/>
+      <w:r>
+        <w:rPr>
+          <w:rFonts w:cs="Times New Roman"/>
+          <w:sz w:val="24"/>
+          <w:szCs w:val="24"/>
+        </w:rPr>
+        <w:t>Р</w:t>
       </w:r>
       <w:r>
         <w:rPr>
@@ -1031,13 +1067,23 @@
         </w:rPr>
         <w:t>г</w:t>
       </w:r>
-      <w:r>
-        <w:rPr>
-          <w:rFonts w:cs="Times New Roman"/>
-          <w:sz w:val="24"/>
-          <w:szCs w:val="24"/>
-        </w:rPr>
-        <w:t>/V</w:t>
+      <w:proofErr w:type="spellEnd"/>
+      <w:r>
+        <w:rPr>
+          <w:rFonts w:cs="Times New Roman"/>
+          <w:sz w:val="24"/>
+          <w:szCs w:val="24"/>
+        </w:rPr>
+        <w:t>/</w:t>
+      </w:r>
+      <w:proofErr w:type="spellStart"/>
+      <w:r>
+        <w:rPr>
+          <w:rFonts w:cs="Times New Roman"/>
+          <w:sz w:val="24"/>
+          <w:szCs w:val="24"/>
+        </w:rPr>
+        <w:t>V</w:t>
       </w:r>
       <w:r>
         <w:rPr>
@@ -1048,6 +1094,7 @@
         </w:rPr>
         <w:t>г</w:t>
       </w:r>
+      <w:proofErr w:type="spellEnd"/>
       <w:r>
         <w:rPr>
           <w:rFonts w:cs="Times New Roman"/>
@@ -1131,13 +1178,23 @@
         </w:rPr>
         <w:t>c</w:t>
       </w:r>
-      <w:r>
-        <w:rPr>
-          <w:rFonts w:cs="Times New Roman"/>
-          <w:sz w:val="24"/>
-          <w:szCs w:val="24"/>
-        </w:rPr>
-        <w:t xml:space="preserve">ек.                     </w:t>
+      <w:proofErr w:type="spellStart"/>
+      <w:r>
+        <w:rPr>
+          <w:rFonts w:cs="Times New Roman"/>
+          <w:sz w:val="24"/>
+          <w:szCs w:val="24"/>
+        </w:rPr>
+        <w:t>ек</w:t>
+      </w:r>
+      <w:proofErr w:type="spellEnd"/>
+      <w:r>
+        <w:rPr>
+          <w:rFonts w:cs="Times New Roman"/>
+          <w:sz w:val="24"/>
+          <w:szCs w:val="24"/>
+        </w:rPr>
+        <w:t xml:space="preserve">.                     </w:t>
       </w:r>
       <w:r>
         <w:rPr>
@@ -1154,7 +1211,25 @@
           <w:sz w:val="24"/>
           <w:szCs w:val="24"/>
         </w:rPr>
-        <w:t xml:space="preserve"> =  π × </w:t>
+        <w:t xml:space="preserve"> </w:t>
+      </w:r>
+      <w:proofErr w:type="gramStart"/>
+      <w:r>
+        <w:rPr>
+          <w:rFonts w:cs="Times New Roman"/>
+          <w:sz w:val="24"/>
+          <w:szCs w:val="24"/>
+        </w:rPr>
+        <w:t>=  π</w:t>
+      </w:r>
+      <w:proofErr w:type="gramEnd"/>
+      <w:r>
+        <w:rPr>
+          <w:rFonts w:cs="Times New Roman"/>
+          <w:sz w:val="24"/>
+          <w:szCs w:val="24"/>
+        </w:rPr>
+        <w:t xml:space="preserve"> × </w:t>
       </w:r>
       <w:r>
         <w:rPr>
@@ -1324,7 +1399,16 @@
           <w:szCs w:val="24"/>
         </w:rPr>
         <w:lastRenderedPageBreak/>
-        <w:t>µ - коэффициент расхода, учитывает форму отверстия (m = 0,7 - 0,9), в расчетах принимается µ = 0,8; Р</w:t>
+        <w:t xml:space="preserve">µ - коэффициент расхода, учитывает форму отверстия (m = 0,7 - 0,9), в расчетах принимается µ = 0,8; </w:t>
+      </w:r>
+      <w:proofErr w:type="spellStart"/>
+      <w:r>
+        <w:rPr>
+          <w:rFonts w:cs="Times New Roman"/>
+          <w:sz w:val="24"/>
+          <w:szCs w:val="24"/>
+        </w:rPr>
+        <w:t>Р</w:t>
       </w:r>
       <w:r>
         <w:rPr>
@@ -1335,6 +1419,7 @@
         </w:rPr>
         <w:t>г</w:t>
       </w:r>
+      <w:proofErr w:type="spellEnd"/>
       <w:r>
         <w:rPr>
           <w:rFonts w:cs="Times New Roman"/>
@@ -1352,6 +1437,7 @@
           <w:szCs w:val="24"/>
         </w:rPr>
       </w:pPr>
+      <w:proofErr w:type="spellStart"/>
       <w:r>
         <w:rPr>
           <w:rFonts w:cs="Times New Roman"/>
@@ -1369,6 +1455,7 @@
         </w:rPr>
         <w:t>г</w:t>
       </w:r>
+      <w:proofErr w:type="spellEnd"/>
       <w:r>
         <w:rPr>
           <w:rFonts w:cs="Times New Roman"/>
@@ -1386,6 +1473,7 @@
           <w:szCs w:val="24"/>
         </w:rPr>
       </w:pPr>
+      <w:proofErr w:type="spellStart"/>
       <w:r>
         <w:rPr>
           <w:rFonts w:cs="Times New Roman"/>
@@ -1403,6 +1491,7 @@
         </w:rPr>
         <w:t>г</w:t>
       </w:r>
+      <w:proofErr w:type="spellEnd"/>
       <w:r>
         <w:rPr>
           <w:rFonts w:cs="Times New Roman"/>
@@ -2480,7 +2569,25 @@
           <w:sz w:val="24"/>
           <w:szCs w:val="24"/>
         </w:rPr>
-        <w:t>0,7 = 0,094 (кг).</w:t>
+        <w:t>0</w:t>
+      </w:r>
+      <w:proofErr w:type="gramStart"/>
+      <w:r>
+        <w:rPr>
+          <w:rFonts w:cs="Times New Roman"/>
+          <w:sz w:val="24"/>
+          <w:szCs w:val="24"/>
+        </w:rPr>
+        <w:t>,7</w:t>
+      </w:r>
+      <w:proofErr w:type="gramEnd"/>
+      <w:r>
+        <w:rPr>
+          <w:rFonts w:cs="Times New Roman"/>
+          <w:sz w:val="24"/>
+          <w:szCs w:val="24"/>
+        </w:rPr>
+        <w:t xml:space="preserve"> = 0,094 (кг).</w:t>
       </w:r>
     </w:p>
     <w:p>
@@ -2730,6 +2837,7 @@
           <w:szCs w:val="24"/>
         </w:rPr>
       </w:pPr>
+      <w:proofErr w:type="spellStart"/>
       <w:r>
         <w:rPr>
           <w:rFonts w:cs="Times New Roman"/>
@@ -2747,6 +2855,7 @@
         </w:rPr>
         <w:t>г</w:t>
       </w:r>
+      <w:proofErr w:type="spellEnd"/>
       <w:r>
         <w:rPr>
           <w:rFonts w:cs="Times New Roman"/>
@@ -2847,7 +2956,61 @@
           <w:sz w:val="24"/>
           <w:szCs w:val="24"/>
         </w:rPr>
-        <w:t>Избыточное давление ΔР для индивидуальных горючих веществ, состоящих из атомов С, Н, О, N, Сl, Вr, I, F, определяется по формуле</w:t>
+        <w:t xml:space="preserve">Избыточное давление ΔР для индивидуальных горючих веществ, состоящих из атомов С, Н, </w:t>
+      </w:r>
+      <w:proofErr w:type="gramStart"/>
+      <w:r>
+        <w:rPr>
+          <w:rFonts w:cs="Times New Roman"/>
+          <w:sz w:val="24"/>
+          <w:szCs w:val="24"/>
+        </w:rPr>
+        <w:t>О</w:t>
+      </w:r>
+      <w:proofErr w:type="gramEnd"/>
+      <w:r>
+        <w:rPr>
+          <w:rFonts w:cs="Times New Roman"/>
+          <w:sz w:val="24"/>
+          <w:szCs w:val="24"/>
+        </w:rPr>
+        <w:t xml:space="preserve">, N, </w:t>
+      </w:r>
+      <w:proofErr w:type="spellStart"/>
+      <w:r>
+        <w:rPr>
+          <w:rFonts w:cs="Times New Roman"/>
+          <w:sz w:val="24"/>
+          <w:szCs w:val="24"/>
+        </w:rPr>
+        <w:t>Сl</w:t>
+      </w:r>
+      <w:proofErr w:type="spellEnd"/>
+      <w:r>
+        <w:rPr>
+          <w:rFonts w:cs="Times New Roman"/>
+          <w:sz w:val="24"/>
+          <w:szCs w:val="24"/>
+        </w:rPr>
+        <w:t xml:space="preserve">, </w:t>
+      </w:r>
+      <w:proofErr w:type="spellStart"/>
+      <w:r>
+        <w:rPr>
+          <w:rFonts w:cs="Times New Roman"/>
+          <w:sz w:val="24"/>
+          <w:szCs w:val="24"/>
+        </w:rPr>
+        <w:t>Вr</w:t>
+      </w:r>
+      <w:proofErr w:type="spellEnd"/>
+      <w:r>
+        <w:rPr>
+          <w:rFonts w:cs="Times New Roman"/>
+          <w:sz w:val="24"/>
+          <w:szCs w:val="24"/>
+        </w:rPr>
+        <w:t>, I, F, определяется по формуле</w:t>
       </w:r>
     </w:p>
     <w:p>
@@ -2876,7 +3039,17 @@
           <w:szCs w:val="24"/>
           <w:lang w:eastAsia="ru-RU"/>
         </w:rPr>
-        <w:t>∆Р = (Р</w:t>
+        <w:t>∆Р = (</w:t>
+      </w:r>
+      <w:proofErr w:type="spellStart"/>
+      <w:r>
+        <w:rPr>
+          <w:rFonts w:eastAsia="Times New Roman" w:cs="Times New Roman"/>
+          <w:sz w:val="24"/>
+          <w:szCs w:val="24"/>
+          <w:lang w:eastAsia="ru-RU"/>
+        </w:rPr>
+        <w:t>Р</w:t>
       </w:r>
       <w:r>
         <w:rPr>
@@ -2888,6 +3061,7 @@
         </w:rPr>
         <w:t>max</w:t>
       </w:r>
+      <w:proofErr w:type="spellEnd"/>
       <w:r>
         <w:rPr>
           <w:rFonts w:eastAsia="Times New Roman" w:cs="Times New Roman"/>
@@ -2914,7 +3088,17 @@
           <w:szCs w:val="24"/>
           <w:lang w:eastAsia="ru-RU"/>
         </w:rPr>
-        <w:t>) ∙ ((m</w:t>
+        <w:t>) ∙ ((</w:t>
+      </w:r>
+      <w:proofErr w:type="spellStart"/>
+      <w:r>
+        <w:rPr>
+          <w:rFonts w:eastAsia="Times New Roman" w:cs="Times New Roman"/>
+          <w:sz w:val="24"/>
+          <w:szCs w:val="24"/>
+          <w:lang w:eastAsia="ru-RU"/>
+        </w:rPr>
+        <w:t>m</w:t>
       </w:r>
       <w:r>
         <w:rPr>
@@ -2931,7 +3115,27 @@
           <w:szCs w:val="24"/>
           <w:lang w:eastAsia="ru-RU"/>
         </w:rPr>
-        <w:t>Z)/(V</w:t>
+        <w:t>Z</w:t>
+      </w:r>
+      <w:proofErr w:type="spellEnd"/>
+      <w:r>
+        <w:rPr>
+          <w:rFonts w:eastAsia="Times New Roman" w:cs="Times New Roman"/>
+          <w:sz w:val="24"/>
+          <w:szCs w:val="24"/>
+          <w:lang w:eastAsia="ru-RU"/>
+        </w:rPr>
+        <w:t>)/(</w:t>
+      </w:r>
+      <w:proofErr w:type="spellStart"/>
+      <w:r>
+        <w:rPr>
+          <w:rFonts w:eastAsia="Times New Roman" w:cs="Times New Roman"/>
+          <w:sz w:val="24"/>
+          <w:szCs w:val="24"/>
+          <w:lang w:eastAsia="ru-RU"/>
+        </w:rPr>
+        <w:t>V</w:t>
       </w:r>
       <w:r>
         <w:rPr>
@@ -2968,17 +3172,9 @@
           <w:vertAlign w:val="subscript"/>
           <w:lang w:eastAsia="ru-RU"/>
         </w:rPr>
-        <w:t>г.п.</w:t>
-      </w:r>
-      <w:r>
-        <w:rPr>
-          <w:rFonts w:eastAsia="Times New Roman" w:cs="Times New Roman"/>
-          <w:sz w:val="24"/>
-          <w:szCs w:val="24"/>
-          <w:lang w:eastAsia="ru-RU"/>
-        </w:rPr>
-        <w:t>)) ∙ (100/С</w:t>
-      </w:r>
+        <w:t>г.п</w:t>
+      </w:r>
+      <w:proofErr w:type="spellEnd"/>
       <w:r>
         <w:rPr>
           <w:rFonts w:eastAsia="Times New Roman" w:cs="Times New Roman"/>
@@ -2987,7 +3183,7 @@
           <w:vertAlign w:val="subscript"/>
           <w:lang w:eastAsia="ru-RU"/>
         </w:rPr>
-        <w:t>ст</w:t>
+        <w:t>.</w:t>
       </w:r>
       <w:r>
         <w:rPr>
@@ -2996,7 +3192,17 @@
           <w:szCs w:val="24"/>
           <w:lang w:eastAsia="ru-RU"/>
         </w:rPr>
-        <w:t>) ∙ (1/К</w:t>
+        <w:t>)) ∙ (100/</w:t>
+      </w:r>
+      <w:proofErr w:type="spellStart"/>
+      <w:r>
+        <w:rPr>
+          <w:rFonts w:eastAsia="Times New Roman" w:cs="Times New Roman"/>
+          <w:sz w:val="24"/>
+          <w:szCs w:val="24"/>
+          <w:lang w:eastAsia="ru-RU"/>
+        </w:rPr>
+        <w:t>С</w:t>
       </w:r>
       <w:r>
         <w:rPr>
@@ -3006,8 +3212,39 @@
           <w:vertAlign w:val="subscript"/>
           <w:lang w:eastAsia="ru-RU"/>
         </w:rPr>
+        <w:t>ст</w:t>
+      </w:r>
+      <w:proofErr w:type="spellEnd"/>
+      <w:r>
+        <w:rPr>
+          <w:rFonts w:eastAsia="Times New Roman" w:cs="Times New Roman"/>
+          <w:sz w:val="24"/>
+          <w:szCs w:val="24"/>
+          <w:lang w:eastAsia="ru-RU"/>
+        </w:rPr>
+        <w:t>) ∙ (1/</w:t>
+      </w:r>
+      <w:proofErr w:type="spellStart"/>
+      <w:r>
+        <w:rPr>
+          <w:rFonts w:eastAsia="Times New Roman" w:cs="Times New Roman"/>
+          <w:sz w:val="24"/>
+          <w:szCs w:val="24"/>
+          <w:lang w:eastAsia="ru-RU"/>
+        </w:rPr>
+        <w:t>К</w:t>
+      </w:r>
+      <w:r>
+        <w:rPr>
+          <w:rFonts w:eastAsia="Times New Roman" w:cs="Times New Roman"/>
+          <w:sz w:val="24"/>
+          <w:szCs w:val="24"/>
+          <w:vertAlign w:val="subscript"/>
+          <w:lang w:eastAsia="ru-RU"/>
+        </w:rPr>
         <w:t>н</w:t>
       </w:r>
+      <w:proofErr w:type="spellEnd"/>
       <w:r>
         <w:rPr>
           <w:rFonts w:eastAsia="Times New Roman" w:cs="Times New Roman"/>
@@ -3065,6 +3302,7 @@
           <w:lang w:eastAsia="ru-RU"/>
         </w:rPr>
       </w:pPr>
+      <w:proofErr w:type="spellStart"/>
       <w:r>
         <w:rPr>
           <w:rFonts w:eastAsia="Times New Roman" w:cs="Times New Roman"/>
@@ -3084,6 +3322,7 @@
         </w:rPr>
         <w:t>max</w:t>
       </w:r>
+      <w:proofErr w:type="spellEnd"/>
       <w:r>
         <w:rPr>
           <w:rFonts w:eastAsia="Times New Roman" w:cs="Times New Roman"/>
@@ -3091,7 +3330,27 @@
           <w:szCs w:val="24"/>
           <w:lang w:eastAsia="ru-RU"/>
         </w:rPr>
-        <w:t xml:space="preserve"> – максимальное давление взрыва стехиометрической газовоздушной смеси в замкнутом объеме</w:t>
+        <w:t xml:space="preserve"> – максимальное давление взрыва стехиометрической </w:t>
+      </w:r>
+      <w:proofErr w:type="spellStart"/>
+      <w:r>
+        <w:rPr>
+          <w:rFonts w:eastAsia="Times New Roman" w:cs="Times New Roman"/>
+          <w:sz w:val="24"/>
+          <w:szCs w:val="24"/>
+          <w:lang w:eastAsia="ru-RU"/>
+        </w:rPr>
+        <w:t>газовоздушной</w:t>
+      </w:r>
+      <w:proofErr w:type="spellEnd"/>
+      <w:r>
+        <w:rPr>
+          <w:rFonts w:eastAsia="Times New Roman" w:cs="Times New Roman"/>
+          <w:sz w:val="24"/>
+          <w:szCs w:val="24"/>
+          <w:lang w:eastAsia="ru-RU"/>
+        </w:rPr>
+        <w:t xml:space="preserve"> смеси в замкнутом объеме</w:t>
       </w:r>
       <w:r>
         <w:rPr>
@@ -3177,6 +3436,7 @@
           <w:lang w:eastAsia="ru-RU"/>
         </w:rPr>
       </w:pPr>
+      <w:proofErr w:type="spellStart"/>
       <w:r>
         <w:rPr>
           <w:rFonts w:eastAsia="Times New Roman" w:cs="Times New Roman"/>
@@ -3196,6 +3456,7 @@
         </w:rPr>
         <w:t>н</w:t>
       </w:r>
+      <w:proofErr w:type="spellEnd"/>
       <w:r>
         <w:rPr>
           <w:rFonts w:eastAsia="Times New Roman" w:cs="Times New Roman"/>
@@ -3203,7 +3464,47 @@
           <w:szCs w:val="24"/>
           <w:lang w:eastAsia="ru-RU"/>
         </w:rPr>
-        <w:t xml:space="preserve"> – коэффициент, учитывающий негерметичность помещения и неадиабатичность процесса горения (допускается принимать равным 3),</w:t>
+        <w:t xml:space="preserve"> – коэффициент, учитывающий </w:t>
+      </w:r>
+      <w:proofErr w:type="spellStart"/>
+      <w:r>
+        <w:rPr>
+          <w:rFonts w:eastAsia="Times New Roman" w:cs="Times New Roman"/>
+          <w:sz w:val="24"/>
+          <w:szCs w:val="24"/>
+          <w:lang w:eastAsia="ru-RU"/>
+        </w:rPr>
+        <w:t>негерметичность</w:t>
+      </w:r>
+      <w:proofErr w:type="spellEnd"/>
+      <w:r>
+        <w:rPr>
+          <w:rFonts w:eastAsia="Times New Roman" w:cs="Times New Roman"/>
+          <w:sz w:val="24"/>
+          <w:szCs w:val="24"/>
+          <w:lang w:eastAsia="ru-RU"/>
+        </w:rPr>
+        <w:t xml:space="preserve"> помещения и </w:t>
+      </w:r>
+      <w:proofErr w:type="spellStart"/>
+      <w:r>
+        <w:rPr>
+          <w:rFonts w:eastAsia="Times New Roman" w:cs="Times New Roman"/>
+          <w:sz w:val="24"/>
+          <w:szCs w:val="24"/>
+          <w:lang w:eastAsia="ru-RU"/>
+        </w:rPr>
+        <w:t>неадиабатичность</w:t>
+      </w:r>
+      <w:proofErr w:type="spellEnd"/>
+      <w:r>
+        <w:rPr>
+          <w:rFonts w:eastAsia="Times New Roman" w:cs="Times New Roman"/>
+          <w:sz w:val="24"/>
+          <w:szCs w:val="24"/>
+          <w:lang w:eastAsia="ru-RU"/>
+        </w:rPr>
+        <w:t xml:space="preserve"> процесса горения (допускается принимать равным 3),</w:t>
       </w:r>
     </w:p>
     <w:p>
@@ -3215,6 +3516,7 @@
           <w:szCs w:val="24"/>
         </w:rPr>
       </w:pPr>
+      <w:proofErr w:type="spellStart"/>
       <w:r>
         <w:rPr>
           <w:rFonts w:eastAsia="Times New Roman" w:cs="Times New Roman"/>
@@ -3234,6 +3536,7 @@
         </w:rPr>
         <w:t>св</w:t>
       </w:r>
+      <w:proofErr w:type="spellEnd"/>
       <w:r>
         <w:rPr>
           <w:rFonts w:eastAsia="Times New Roman" w:cs="Times New Roman"/>
@@ -3280,6 +3583,7 @@
           <w:szCs w:val="24"/>
         </w:rPr>
       </w:pPr>
+      <w:proofErr w:type="spellStart"/>
       <w:r>
         <w:rPr>
           <w:rFonts w:eastAsia="Times New Roman" w:cs="Times New Roman"/>
@@ -3297,7 +3601,18 @@
           <w:vertAlign w:val="subscript"/>
           <w:lang w:eastAsia="ru-RU"/>
         </w:rPr>
-        <w:t>г.п.</w:t>
+        <w:t>г.п</w:t>
+      </w:r>
+      <w:proofErr w:type="spellEnd"/>
+      <w:r>
+        <w:rPr>
+          <w:rFonts w:eastAsia="Times New Roman" w:cs="Times New Roman"/>
+          <w:sz w:val="24"/>
+          <w:szCs w:val="24"/>
+          <w:vertAlign w:val="subscript"/>
+          <w:lang w:eastAsia="ru-RU"/>
+        </w:rPr>
+        <w:t>.</w:t>
       </w:r>
       <w:r>
         <w:rPr>
@@ -3346,19 +3661,31 @@
           <w:szCs w:val="24"/>
           <w:lang w:eastAsia="ru-RU"/>
         </w:rPr>
-        <w:t>при V</w:t>
-      </w:r>
+        <w:t xml:space="preserve">при </w:t>
+      </w:r>
+      <w:proofErr w:type="spellStart"/>
       <w:r>
         <w:rPr>
           <w:rFonts w:eastAsia="Times New Roman" w:cs="Times New Roman"/>
           <w:color w:val="000000"/>
           <w:sz w:val="24"/>
           <w:szCs w:val="24"/>
+          <w:lang w:eastAsia="ru-RU"/>
+        </w:rPr>
+        <w:t>V</w:t>
+      </w:r>
+      <w:r>
+        <w:rPr>
+          <w:rFonts w:eastAsia="Times New Roman" w:cs="Times New Roman"/>
+          <w:color w:val="000000"/>
+          <w:sz w:val="24"/>
+          <w:szCs w:val="24"/>
           <w:vertAlign w:val="subscript"/>
           <w:lang w:eastAsia="ru-RU"/>
         </w:rPr>
         <w:t>св</w:t>
       </w:r>
+      <w:proofErr w:type="spellEnd"/>
       <w:r>
         <w:rPr>
           <w:rFonts w:eastAsia="Times New Roman" w:cs="Times New Roman"/>
@@ -3418,6 +3745,7 @@
           <w:szCs w:val="24"/>
         </w:rPr>
       </w:pPr>
+      <w:proofErr w:type="spellStart"/>
       <w:r>
         <w:rPr>
           <w:rFonts w:eastAsia="Times New Roman" w:cs="Times New Roman"/>
@@ -3435,7 +3763,18 @@
           <w:vertAlign w:val="subscript"/>
           <w:lang w:eastAsia="ru-RU"/>
         </w:rPr>
-        <w:t>г.п.</w:t>
+        <w:t>г.п</w:t>
+      </w:r>
+      <w:proofErr w:type="spellEnd"/>
+      <w:r>
+        <w:rPr>
+          <w:rFonts w:eastAsia="Times New Roman" w:cs="Times New Roman"/>
+          <w:sz w:val="24"/>
+          <w:szCs w:val="24"/>
+          <w:vertAlign w:val="subscript"/>
+          <w:lang w:eastAsia="ru-RU"/>
+        </w:rPr>
+        <w:t>.</w:t>
       </w:r>
       <w:r>
         <w:rPr>
@@ -3562,7 +3901,25 @@
           <w:sz w:val="24"/>
           <w:szCs w:val="24"/>
         </w:rPr>
-        <w:t xml:space="preserve">. В результате расчета было определено избыточное давление волны взрыва облака газовоздушной смеси в помещении котельной, согласно </w:t>
+        <w:t xml:space="preserve">. В результате расчета было определено избыточное давление волны взрыва облака </w:t>
+      </w:r>
+      <w:proofErr w:type="spellStart"/>
+      <w:r>
+        <w:rPr>
+          <w:rFonts w:cs="Times New Roman"/>
+          <w:sz w:val="24"/>
+          <w:szCs w:val="24"/>
+        </w:rPr>
+        <w:t>газовоздушной</w:t>
+      </w:r>
+      <w:proofErr w:type="spellEnd"/>
+      <w:r>
+        <w:rPr>
+          <w:rFonts w:cs="Times New Roman"/>
+          <w:sz w:val="24"/>
+          <w:szCs w:val="24"/>
+        </w:rPr>
+        <w:t xml:space="preserve"> смеси в помещении котельной, согласно </w:t>
       </w:r>
       <w:r>
         <w:rPr>
@@ -3617,6 +3974,7 @@
           <w:szCs w:val="24"/>
         </w:rPr>
       </w:pPr>
+      <w:proofErr w:type="gramStart"/>
       <w:r>
         <w:rPr>
           <w:rFonts w:cs="Times New Roman"/>
@@ -3624,7 +3982,17 @@
           <w:sz w:val="24"/>
           <w:szCs w:val="24"/>
         </w:rPr>
-        <w:t>8.2  Прогнозирование зоны поражения тепловым излучением «огненного шара»</w:t>
+        <w:t>8.2  Прогнозирование</w:t>
+      </w:r>
+      <w:proofErr w:type="gramEnd"/>
+      <w:r>
+        <w:rPr>
+          <w:rFonts w:cs="Times New Roman"/>
+          <w:b/>
+          <w:sz w:val="24"/>
+          <w:szCs w:val="24"/>
+        </w:rPr>
+        <w:t xml:space="preserve"> зоны поражения тепловым излучением «огненного шара»</w:t>
       </w:r>
     </w:p>
     <w:p>
@@ -3752,13 +4120,15 @@
           <w:sz w:val="24"/>
           <w:szCs w:val="24"/>
           <w:highlight w:val="green"/>
-        </w:rPr>
-      </w:pPr>
-      <w:r>
-        <w:rPr>
-          <w:rFonts w:cs="Times New Roman"/>
-          <w:sz w:val="24"/>
-          <w:szCs w:val="24"/>
+          <w:lang w:val="en-US"/>
+        </w:rPr>
+      </w:pPr>
+      <w:r>
+        <w:rPr>
+          <w:rFonts w:cs="Times New Roman"/>
+          <w:sz w:val="24"/>
+          <w:szCs w:val="24"/>
+          <w:lang w:val="en-US"/>
         </w:rPr>
         <w:t>D</w:t>
       </w:r>
@@ -3776,16 +4146,29 @@
           <w:rFonts w:cs="Times New Roman"/>
           <w:sz w:val="24"/>
           <w:szCs w:val="24"/>
-        </w:rPr>
-        <w:t xml:space="preserve"> = 5,33 × 0,</w:t>
-      </w:r>
-      <w:r>
-        <w:rPr>
-          <w:rFonts w:cs="Times New Roman"/>
-          <w:sz w:val="24"/>
-          <w:szCs w:val="24"/>
-        </w:rPr>
-        <w:t>338</w:t>
+          <w:lang w:val="en-US"/>
+        </w:rPr>
+        <w:t xml:space="preserve"> = 5</w:t>
+      </w:r>
+      <w:proofErr w:type="gramStart"/>
+      <w:r>
+        <w:rPr>
+          <w:rFonts w:cs="Times New Roman"/>
+          <w:sz w:val="24"/>
+          <w:szCs w:val="24"/>
+          <w:lang w:val="en-US"/>
+        </w:rPr>
+        <w:t>,33</w:t>
+      </w:r>
+      <w:proofErr w:type="gramEnd"/>
+      <w:r>
+        <w:rPr>
+          <w:rFonts w:cs="Times New Roman"/>
+          <w:sz w:val="24"/>
+          <w:szCs w:val="24"/>
+          <w:lang w:val="en-US"/>
+        </w:rPr>
+        <w:t xml:space="preserve"> × 0,338</w:t>
       </w:r>
       <w:r>
         <w:rPr>
@@ -3793,6 +4176,7 @@
           <w:sz w:val="24"/>
           <w:szCs w:val="24"/>
           <w:vertAlign w:val="superscript"/>
+          <w:lang w:val="en-US"/>
         </w:rPr>
         <w:t>0,327</w:t>
       </w:r>
@@ -3801,16 +4185,29 @@
           <w:rFonts w:cs="Times New Roman"/>
           <w:sz w:val="24"/>
           <w:szCs w:val="24"/>
-        </w:rPr>
-        <w:t xml:space="preserve"> = 3,7</w:t>
-      </w:r>
-      <w:r>
-        <w:rPr>
-          <w:rFonts w:cs="Times New Roman"/>
-          <w:sz w:val="24"/>
-          <w:szCs w:val="24"/>
-        </w:rPr>
-        <w:t xml:space="preserve">4 </w:t>
+          <w:lang w:val="en-US"/>
+        </w:rPr>
+        <w:t xml:space="preserve"> = {{ </w:t>
+      </w:r>
+      <w:proofErr w:type="spellStart"/>
+      <w:r>
+        <w:rPr>
+          <w:rFonts w:cs="Times New Roman"/>
+          <w:sz w:val="24"/>
+          <w:szCs w:val="24"/>
+          <w:lang w:val="en-US"/>
+        </w:rPr>
+        <w:t>fireball_params.Ds_m</w:t>
+      </w:r>
+      <w:proofErr w:type="spellEnd"/>
+      <w:r>
+        <w:rPr>
+          <w:rFonts w:cs="Times New Roman"/>
+          <w:sz w:val="24"/>
+          <w:szCs w:val="24"/>
+          <w:lang w:val="en-US"/>
+        </w:rPr>
+        <w:t xml:space="preserve"> }} </w:t>
       </w:r>
       <w:r>
         <w:rPr>
@@ -3828,6 +4225,7 @@
           <w:sz w:val="24"/>
           <w:szCs w:val="24"/>
           <w:highlight w:val="green"/>
+          <w:lang w:val="en-US"/>
         </w:rPr>
       </w:pPr>
     </w:p>
@@ -3838,21 +4236,66 @@
           <w:sz w:val="24"/>
           <w:szCs w:val="24"/>
           <w:highlight w:val="green"/>
-        </w:rPr>
-      </w:pPr>
-      <w:r>
-        <w:rPr>
-          <w:rFonts w:cs="Times New Roman"/>
-          <w:sz w:val="24"/>
-          <w:szCs w:val="24"/>
-        </w:rPr>
-        <w:t>Высота «огненного шара»</w:t>
-      </w:r>
-      <w:r>
-        <w:rPr>
-          <w:rFonts w:cs="Times New Roman"/>
-          <w:sz w:val="24"/>
-          <w:szCs w:val="24"/>
+          <w:lang w:val="en-US"/>
+        </w:rPr>
+      </w:pPr>
+      <w:r>
+        <w:rPr>
+          <w:rFonts w:cs="Times New Roman"/>
+          <w:sz w:val="24"/>
+          <w:szCs w:val="24"/>
+        </w:rPr>
+        <w:t>Высота</w:t>
+      </w:r>
+      <w:r>
+        <w:rPr>
+          <w:rFonts w:cs="Times New Roman"/>
+          <w:sz w:val="24"/>
+          <w:szCs w:val="24"/>
+          <w:lang w:val="en-US"/>
+        </w:rPr>
+        <w:t xml:space="preserve"> «</w:t>
+      </w:r>
+      <w:r>
+        <w:rPr>
+          <w:rFonts w:cs="Times New Roman"/>
+          <w:sz w:val="24"/>
+          <w:szCs w:val="24"/>
+        </w:rPr>
+        <w:t>огненного</w:t>
+      </w:r>
+      <w:r>
+        <w:rPr>
+          <w:rFonts w:cs="Times New Roman"/>
+          <w:sz w:val="24"/>
+          <w:szCs w:val="24"/>
+          <w:lang w:val="en-US"/>
+        </w:rPr>
+        <w:t xml:space="preserve"> </w:t>
+      </w:r>
+      <w:r>
+        <w:rPr>
+          <w:rFonts w:cs="Times New Roman"/>
+          <w:sz w:val="24"/>
+          <w:szCs w:val="24"/>
+        </w:rPr>
+        <w:t>шара</w:t>
+      </w:r>
+      <w:r>
+        <w:rPr>
+          <w:rFonts w:cs="Times New Roman"/>
+          <w:sz w:val="24"/>
+          <w:szCs w:val="24"/>
+          <w:lang w:val="en-US"/>
+        </w:rPr>
+        <w:t>»</w:t>
+      </w:r>
+      <w:r>
+        <w:rPr>
+          <w:rFonts w:cs="Times New Roman"/>
+          <w:sz w:val="24"/>
+          <w:szCs w:val="24"/>
+          <w:lang w:val="en-US"/>
         </w:rPr>
         <w:tab/>
       </w:r>
@@ -3861,9 +4304,17 @@
           <w:rFonts w:cs="Times New Roman"/>
           <w:sz w:val="24"/>
           <w:szCs w:val="24"/>
+          <w:lang w:val="en-US"/>
         </w:rPr>
         <w:tab/>
-        <w:t>Н = D</w:t>
+      </w:r>
+      <w:r>
+        <w:rPr>
+          <w:rFonts w:cs="Times New Roman"/>
+          <w:sz w:val="24"/>
+          <w:szCs w:val="24"/>
+        </w:rPr>
+        <w:t>Н</w:t>
       </w:r>
       <w:r>
         <w:rPr>
@@ -3872,6 +4323,15 @@
           <w:szCs w:val="24"/>
           <w:lang w:val="en-US"/>
         </w:rPr>
+        <w:t xml:space="preserve"> = D</w:t>
+      </w:r>
+      <w:r>
+        <w:rPr>
+          <w:rFonts w:cs="Times New Roman"/>
+          <w:sz w:val="24"/>
+          <w:szCs w:val="24"/>
+          <w:lang w:val="en-US"/>
+        </w:rPr>
         <w:t>s</w:t>
       </w:r>
       <w:r>
@@ -3879,24 +4339,57 @@
           <w:rFonts w:cs="Times New Roman"/>
           <w:sz w:val="24"/>
           <w:szCs w:val="24"/>
+          <w:lang w:val="en-US"/>
         </w:rPr>
         <w:t xml:space="preserve">/2 = </w:t>
       </w:r>
-      <w:r>
-        <w:rPr>
-          <w:rFonts w:cs="Times New Roman"/>
-          <w:sz w:val="24"/>
-          <w:szCs w:val="24"/>
-        </w:rPr>
-        <w:t>1,87</w:t>
-      </w:r>
-      <w:r>
-        <w:rPr>
-          <w:rFonts w:cs="Times New Roman"/>
-          <w:sz w:val="24"/>
-          <w:szCs w:val="24"/>
-        </w:rPr>
-        <w:t xml:space="preserve"> м</w:t>
+      <w:proofErr w:type="gramStart"/>
+      <w:r>
+        <w:rPr>
+          <w:rFonts w:cs="Times New Roman"/>
+          <w:sz w:val="24"/>
+          <w:szCs w:val="24"/>
+          <w:lang w:val="en-US"/>
+        </w:rPr>
+        <w:t xml:space="preserve">{{ </w:t>
+      </w:r>
+      <w:proofErr w:type="spellStart"/>
+      <w:r>
+        <w:rPr>
+          <w:rFonts w:cs="Times New Roman"/>
+          <w:sz w:val="24"/>
+          <w:szCs w:val="24"/>
+          <w:lang w:val="en-US"/>
+        </w:rPr>
+        <w:t>fireball</w:t>
+      </w:r>
+      <w:proofErr w:type="gramEnd"/>
+      <w:r>
+        <w:rPr>
+          <w:rFonts w:cs="Times New Roman"/>
+          <w:sz w:val="24"/>
+          <w:szCs w:val="24"/>
+          <w:lang w:val="en-US"/>
+        </w:rPr>
+        <w:t>_params.H_m</w:t>
+      </w:r>
+      <w:proofErr w:type="spellEnd"/>
+      <w:r>
+        <w:rPr>
+          <w:rFonts w:cs="Times New Roman"/>
+          <w:sz w:val="24"/>
+          <w:szCs w:val="24"/>
+          <w:lang w:val="en-US"/>
+        </w:rPr>
+        <w:t xml:space="preserve"> }} </w:t>
+      </w:r>
+      <w:r>
+        <w:rPr>
+          <w:rFonts w:cs="Times New Roman"/>
+          <w:sz w:val="24"/>
+          <w:szCs w:val="24"/>
+        </w:rPr>
+        <w:t>м</w:t>
       </w:r>
     </w:p>
     <w:p>
@@ -3906,6 +4399,7 @@
           <w:sz w:val="24"/>
           <w:szCs w:val="24"/>
           <w:highlight w:val="green"/>
+          <w:lang w:val="en-US"/>
         </w:rPr>
       </w:pPr>
     </w:p>
@@ -3951,7 +4445,25 @@
           <w:sz w:val="24"/>
           <w:szCs w:val="24"/>
         </w:rPr>
-        <w:t>τ = exp (−7 × 10</w:t>
+        <w:t xml:space="preserve">τ = </w:t>
+      </w:r>
+      <w:proofErr w:type="spellStart"/>
+      <w:r>
+        <w:rPr>
+          <w:rFonts w:cs="Times New Roman"/>
+          <w:sz w:val="24"/>
+          <w:szCs w:val="24"/>
+        </w:rPr>
+        <w:t>exp</w:t>
+      </w:r>
+      <w:proofErr w:type="spellEnd"/>
+      <w:r>
+        <w:rPr>
+          <w:rFonts w:cs="Times New Roman"/>
+          <w:sz w:val="24"/>
+          <w:szCs w:val="24"/>
+        </w:rPr>
+        <w:t xml:space="preserve"> (−7 × 10</w:t>
       </w:r>
       <w:r>
         <w:rPr>
@@ -3968,7 +4480,25 @@
           <w:sz w:val="24"/>
           <w:szCs w:val="24"/>
         </w:rPr>
-        <w:t xml:space="preserve"> ×(r</w:t>
+        <w:t xml:space="preserve"> </w:t>
+      </w:r>
+      <w:proofErr w:type="gramStart"/>
+      <w:r>
+        <w:rPr>
+          <w:rFonts w:cs="Times New Roman"/>
+          <w:sz w:val="24"/>
+          <w:szCs w:val="24"/>
+        </w:rPr>
+        <w:t>×(</w:t>
+      </w:r>
+      <w:proofErr w:type="gramEnd"/>
+      <w:r>
+        <w:rPr>
+          <w:rFonts w:cs="Times New Roman"/>
+          <w:sz w:val="24"/>
+          <w:szCs w:val="24"/>
+        </w:rPr>
+        <w:t>r</w:t>
       </w:r>
       <w:r>
         <w:rPr>
@@ -4074,6 +4604,7 @@
         </w:rPr>
         <w:tab/>
       </w:r>
+      <w:proofErr w:type="spellStart"/>
       <w:r>
         <w:rPr>
           <w:rFonts w:cs="Times New Roman"/>
@@ -4093,6 +4624,7 @@
         </w:rPr>
         <w:t>q</w:t>
       </w:r>
+      <w:proofErr w:type="spellEnd"/>
       <w:r>
         <w:rPr>
           <w:rFonts w:cs="Times New Roman"/>
@@ -4133,7 +4665,25 @@
           <w:sz w:val="24"/>
           <w:szCs w:val="24"/>
         </w:rPr>
-        <w:t xml:space="preserve"> + 0,5)/(4×((</w:t>
+        <w:t xml:space="preserve"> + 0,5)</w:t>
+      </w:r>
+      <w:proofErr w:type="gramStart"/>
+      <w:r>
+        <w:rPr>
+          <w:rFonts w:cs="Times New Roman"/>
+          <w:sz w:val="24"/>
+          <w:szCs w:val="24"/>
+        </w:rPr>
+        <w:t>/(</w:t>
+      </w:r>
+      <w:proofErr w:type="gramEnd"/>
+      <w:r>
+        <w:rPr>
+          <w:rFonts w:cs="Times New Roman"/>
+          <w:sz w:val="24"/>
+          <w:szCs w:val="24"/>
+        </w:rPr>
+        <w:t>4×((</w:t>
       </w:r>
       <w:r>
         <w:rPr>
@@ -4369,23 +4919,43 @@
           <w:sz w:val="24"/>
           <w:szCs w:val="24"/>
         </w:rPr>
-        <w:t xml:space="preserve"> = 0,6</w:t>
-      </w:r>
-      <w:r>
-        <w:rPr>
-          <w:rFonts w:cs="Times New Roman"/>
-          <w:sz w:val="24"/>
-          <w:szCs w:val="24"/>
-        </w:rPr>
-        <w:t>6</w:t>
-      </w:r>
-      <w:r>
-        <w:rPr>
-          <w:rFonts w:cs="Times New Roman"/>
-          <w:sz w:val="24"/>
-          <w:szCs w:val="24"/>
-        </w:rPr>
-        <w:t xml:space="preserve"> сек</w:t>
+        <w:t xml:space="preserve"> = </w:t>
+      </w:r>
+      <w:proofErr w:type="gramStart"/>
+      <w:r>
+        <w:rPr>
+          <w:rFonts w:cs="Times New Roman"/>
+          <w:sz w:val="24"/>
+          <w:szCs w:val="24"/>
+        </w:rPr>
+        <w:t xml:space="preserve">{{ </w:t>
+      </w:r>
+      <w:proofErr w:type="spellStart"/>
+      <w:r>
+        <w:rPr>
+          <w:rFonts w:cs="Times New Roman"/>
+          <w:sz w:val="24"/>
+          <w:szCs w:val="24"/>
+        </w:rPr>
+        <w:t>fireball</w:t>
+      </w:r>
+      <w:proofErr w:type="gramEnd"/>
+      <w:r>
+        <w:rPr>
+          <w:rFonts w:cs="Times New Roman"/>
+          <w:sz w:val="24"/>
+          <w:szCs w:val="24"/>
+        </w:rPr>
+        <w:t>_params.ts_s</w:t>
+      </w:r>
+      <w:proofErr w:type="spellEnd"/>
+      <w:r>
+        <w:rPr>
+          <w:rFonts w:cs="Times New Roman"/>
+          <w:sz w:val="24"/>
+          <w:szCs w:val="24"/>
+        </w:rPr>
+        <w:t xml:space="preserve"> }} сек</w:t>
       </w:r>
     </w:p>
     <w:p>
@@ -4504,7 +5074,25 @@
           <w:sz w:val="24"/>
           <w:szCs w:val="24"/>
         </w:rPr>
-        <w:t xml:space="preserve"> = 80 кВт/м</w:t>
+        <w:t xml:space="preserve"> = </w:t>
+      </w:r>
+      <w:proofErr w:type="gramStart"/>
+      <w:r>
+        <w:rPr>
+          <w:rFonts w:cs="Times New Roman"/>
+          <w:sz w:val="24"/>
+          <w:szCs w:val="24"/>
+        </w:rPr>
+        <w:t>{{ fireball</w:t>
+      </w:r>
+      <w:proofErr w:type="gramEnd"/>
+      <w:r>
+        <w:rPr>
+          <w:rFonts w:cs="Times New Roman"/>
+          <w:sz w:val="24"/>
+          <w:szCs w:val="24"/>
+        </w:rPr>
+        <w:t>_params.Ef_kw_m2 }} кВт/м</w:t>
       </w:r>
       <w:r>
         <w:rPr>
@@ -4535,6 +5123,7 @@
           <w:highlight w:val="green"/>
         </w:rPr>
       </w:pPr>
+      <w:proofErr w:type="spellStart"/>
       <w:r>
         <w:rPr>
           <w:rFonts w:cs="Times New Roman"/>
@@ -4554,6 +5143,7 @@
         </w:rPr>
         <w:t>q</w:t>
       </w:r>
+      <w:proofErr w:type="spellEnd"/>
       <w:r>
         <w:rPr>
           <w:rFonts w:cs="Times New Roman"/>
@@ -4597,8 +5187,27 @@
           <w:sz w:val="24"/>
           <w:szCs w:val="24"/>
         </w:rPr>
-        <w:t xml:space="preserve">Для газовоздушной смеси метана </w:t>
-      </w:r>
+        <w:t xml:space="preserve">Для </w:t>
+      </w:r>
+      <w:proofErr w:type="spellStart"/>
+      <w:r>
+        <w:rPr>
+          <w:rFonts w:cs="Times New Roman"/>
+          <w:sz w:val="24"/>
+          <w:szCs w:val="24"/>
+        </w:rPr>
+        <w:t>газовоздушной</w:t>
+      </w:r>
+      <w:proofErr w:type="spellEnd"/>
+      <w:r>
+        <w:rPr>
+          <w:rFonts w:cs="Times New Roman"/>
+          <w:sz w:val="24"/>
+          <w:szCs w:val="24"/>
+        </w:rPr>
+        <w:t xml:space="preserve"> смеси метана </w:t>
+      </w:r>
+      <w:proofErr w:type="spellStart"/>
       <w:r>
         <w:rPr>
           <w:rFonts w:eastAsia="Times New Roman" w:cs="Times New Roman"/>
@@ -4620,6 +5229,7 @@
         </w:rPr>
         <w:t>f</w:t>
       </w:r>
+      <w:proofErr w:type="spellEnd"/>
       <w:r>
         <w:rPr>
           <w:rFonts w:eastAsia="Times New Roman" w:cs="Times New Roman"/>
@@ -4677,6 +5287,7 @@
         </w:rPr>
         <w:t xml:space="preserve">Расчетные данные τ, </w:t>
       </w:r>
+      <w:proofErr w:type="spellStart"/>
       <w:r>
         <w:rPr>
           <w:rFonts w:cs="Times New Roman"/>
@@ -4696,6 +5307,7 @@
         </w:rPr>
         <w:t>q</w:t>
       </w:r>
+      <w:proofErr w:type="spellEnd"/>
       <w:r>
         <w:rPr>
           <w:rFonts w:cs="Times New Roman"/>
@@ -4860,6 +5472,7 @@
                 <w:szCs w:val="24"/>
               </w:rPr>
             </w:pPr>
+            <w:proofErr w:type="spellStart"/>
             <w:r>
               <w:rPr>
                 <w:rFonts w:cs="Times New Roman"/>
@@ -4879,6 +5492,7 @@
               </w:rPr>
               <w:t>q</w:t>
             </w:r>
+            <w:proofErr w:type="spellEnd"/>
           </w:p>
         </w:tc>
         <w:tc>
@@ -6820,10 +7434,10 @@
             <v:path o:extrusionok="f" gradientshapeok="t" o:connecttype="rect"/>
             <o:lock v:ext="edit" aspectratio="t"/>
           </v:shapetype>
-          <v:shape id="_x0000_i1062" type="#_x0000_t75" style="width:139.5pt;height:19.5pt" o:ole="" fillcolor="window">
+          <v:shape id="_x0000_i1025" type="#_x0000_t75" style="width:139.5pt;height:19.5pt" o:ole="" fillcolor="window">
             <v:imagedata r:id="rId6" o:title=""/>
           </v:shape>
-          <o:OLEObject Type="Embed" ProgID="Equation.3" ShapeID="_x0000_i1062" DrawAspect="Content" ObjectID="_1836853799" r:id="rId7"/>
+          <o:OLEObject Type="Embed" ProgID="Equation.3" ShapeID="_x0000_i1025" DrawAspect="Content" ObjectID="_1839506613" r:id="rId7"/>
         </w:object>
       </w:r>
     </w:p>
@@ -6972,10 +7586,10 @@
           <w:szCs w:val="24"/>
         </w:rPr>
         <w:object w:dxaOrig="1460" w:dyaOrig="360">
-          <v:shape id="_x0000_i1063" type="#_x0000_t75" style="width:73.5pt;height:19.5pt" o:ole="" fillcolor="window">
+          <v:shape id="_x0000_i1026" type="#_x0000_t75" style="width:73.5pt;height:19.5pt" o:ole="" fillcolor="window">
             <v:imagedata r:id="rId8" o:title=""/>
           </v:shape>
-          <o:OLEObject Type="Embed" ProgID="Equation.3" ShapeID="_x0000_i1063" DrawAspect="Content" ObjectID="_1836853800" r:id="rId9"/>
+          <o:OLEObject Type="Embed" ProgID="Equation.3" ShapeID="_x0000_i1026" DrawAspect="Content" ObjectID="_1839506614" r:id="rId9"/>
         </w:object>
       </w:r>
       <w:r>
@@ -7363,3407 +7977,8 @@
           <w:lang w:eastAsia="ru-RU"/>
         </w:rPr>
       </w:pPr>
-    </w:p>
-    <w:p>
-      <w:pPr>
-        <w:pStyle w:val="af7"/>
-        <w:numPr>
-          <w:ilvl w:val="0"/>
-          <w:numId w:val="13"/>
-        </w:numPr>
-        <w:ind w:left="1134" w:hanging="425"/>
-        <w:rPr>
-          <w:rFonts w:eastAsia="Times New Roman" w:cs="Times New Roman"/>
-          <w:b/>
-          <w:bCs/>
-          <w:sz w:val="24"/>
-          <w:szCs w:val="24"/>
-          <w:lang w:eastAsia="ru-RU"/>
-        </w:rPr>
-      </w:pPr>
-      <w:r>
-        <w:rPr>
-          <w:rFonts w:eastAsia="Times New Roman" w:cs="Times New Roman"/>
-          <w:b/>
-          <w:bCs/>
-          <w:sz w:val="24"/>
-          <w:szCs w:val="24"/>
-          <w:lang w:eastAsia="ru-RU"/>
-        </w:rPr>
-        <w:t>Расчет размеров зон безвозвратных и санитарных потерь, количества пострадавших людей, а также размера ущерба последствий акта незаконного вмешательства критического элемента №4 (внутренний трубопровод СУГ)</w:t>
-      </w:r>
-    </w:p>
-    <w:p>
-      <w:pPr>
-        <w:rPr>
-          <w:rFonts w:cs="Times New Roman"/>
-          <w:noProof/>
-          <w:sz w:val="24"/>
-          <w:szCs w:val="24"/>
-          <w:lang w:eastAsia="ru-RU"/>
-        </w:rPr>
-      </w:pPr>
-    </w:p>
-    <w:p>
-      <w:pPr>
-        <w:spacing w:line="360" w:lineRule="auto"/>
-        <w:ind w:firstLine="709"/>
-        <w:rPr>
-          <w:rFonts w:cs="Times New Roman"/>
-          <w:b/>
-          <w:sz w:val="24"/>
-          <w:szCs w:val="24"/>
-          <w:highlight w:val="yellow"/>
-        </w:rPr>
-      </w:pPr>
-      <w:r>
-        <w:rPr>
-          <w:rFonts w:cs="Times New Roman"/>
-          <w:b/>
-          <w:sz w:val="24"/>
-          <w:szCs w:val="24"/>
-        </w:rPr>
-        <w:lastRenderedPageBreak/>
-        <w:t>9.1  Расчёт параметров волны давления при разрыве газопровода в замкнутом пространстве.</w:t>
-      </w:r>
-    </w:p>
-    <w:p>
-      <w:pPr>
-        <w:ind w:firstLine="708"/>
-        <w:rPr>
-          <w:rFonts w:cs="Times New Roman"/>
-          <w:sz w:val="24"/>
-          <w:szCs w:val="24"/>
-          <w:highlight w:val="yellow"/>
-        </w:rPr>
-      </w:pPr>
-      <w:r>
-        <w:rPr>
-          <w:rFonts w:cs="Times New Roman"/>
-          <w:sz w:val="24"/>
-          <w:szCs w:val="24"/>
-        </w:rPr>
-        <w:t>Расчетное время отключения трубопроводов определяют в каждом конкретном случае, исходя из реальной обстановки, и должно быть минимальным с учетом паспортных данных на запорные устройства, характера технологического процесса и вида расчетной аварии.</w:t>
-      </w:r>
-    </w:p>
-    <w:p>
-      <w:pPr>
-        <w:ind w:firstLine="708"/>
-        <w:rPr>
-          <w:rFonts w:cs="Times New Roman"/>
-          <w:sz w:val="24"/>
-          <w:szCs w:val="24"/>
-          <w:highlight w:val="yellow"/>
-        </w:rPr>
-      </w:pPr>
-      <w:r>
-        <w:rPr>
-          <w:rFonts w:cs="Times New Roman"/>
-          <w:sz w:val="24"/>
-          <w:szCs w:val="24"/>
-        </w:rPr>
-        <w:t>Расчетное время отключения трубопроводов следует принимать равным:</w:t>
-      </w:r>
-    </w:p>
-    <w:p>
-      <w:pPr>
-        <w:ind w:firstLine="708"/>
-        <w:rPr>
-          <w:rFonts w:cs="Times New Roman"/>
-          <w:sz w:val="24"/>
-          <w:szCs w:val="24"/>
-          <w:highlight w:val="yellow"/>
-        </w:rPr>
-      </w:pPr>
-      <w:r>
-        <w:rPr>
-          <w:rFonts w:cs="Times New Roman"/>
-          <w:sz w:val="24"/>
-          <w:szCs w:val="24"/>
-        </w:rPr>
-        <w:t>- времени срабатывания системы автоматики отключения трубопроводов согласно паспортным данным установки, если вероятность отказа системы автоматики не превышает 0,000001 в год или обеспечено резервирование ее элементов;</w:t>
-      </w:r>
-    </w:p>
-    <w:p>
-      <w:pPr>
-        <w:ind w:firstLine="708"/>
-        <w:rPr>
-          <w:rFonts w:cs="Times New Roman"/>
-          <w:sz w:val="24"/>
-          <w:szCs w:val="24"/>
-          <w:highlight w:val="yellow"/>
-        </w:rPr>
-      </w:pPr>
-      <w:r>
-        <w:rPr>
-          <w:rFonts w:cs="Times New Roman"/>
-          <w:sz w:val="24"/>
-          <w:szCs w:val="24"/>
-        </w:rPr>
-        <w:t>- 120 с, если вероятность отказа системы автоматики превышает 0,000001 в год и не обеспечено резервирование ее элементов;</w:t>
-      </w:r>
-    </w:p>
-    <w:p>
-      <w:pPr>
-        <w:ind w:firstLine="708"/>
-        <w:rPr>
-          <w:rFonts w:cs="Times New Roman"/>
-          <w:sz w:val="24"/>
-          <w:szCs w:val="24"/>
-          <w:highlight w:val="yellow"/>
-        </w:rPr>
-      </w:pPr>
-      <w:r>
-        <w:rPr>
-          <w:rFonts w:cs="Times New Roman"/>
-          <w:sz w:val="24"/>
-          <w:szCs w:val="24"/>
-        </w:rPr>
-        <w:t>- 300 с при ручном отключении;</w:t>
-      </w:r>
-    </w:p>
-    <w:p>
-      <w:pPr>
-        <w:ind w:firstLine="708"/>
-        <w:rPr>
-          <w:rFonts w:cs="Times New Roman"/>
-          <w:sz w:val="24"/>
-          <w:szCs w:val="24"/>
-          <w:highlight w:val="yellow"/>
-        </w:rPr>
-      </w:pPr>
-      <w:r>
-        <w:rPr>
-          <w:rFonts w:cs="Times New Roman"/>
-          <w:sz w:val="24"/>
-          <w:szCs w:val="24"/>
-        </w:rPr>
-        <w:t>Свободный объем помещения определяется как разность между объемом помещения и объемом, занимаемым технологическим оборудованием. Если свободный объем помещения определить невозможно, то его допускается принимать условно, равным 80 % геометрического объема помещения.</w:t>
-      </w:r>
-    </w:p>
-    <w:p>
-      <w:pPr>
-        <w:rPr>
-          <w:rFonts w:cs="Times New Roman"/>
-          <w:b/>
-          <w:bCs/>
-          <w:sz w:val="24"/>
-          <w:szCs w:val="24"/>
-          <w:highlight w:val="yellow"/>
-        </w:rPr>
-      </w:pPr>
-    </w:p>
-    <w:p>
-      <w:pPr>
-        <w:rPr>
-          <w:rFonts w:cs="Times New Roman"/>
-          <w:bCs/>
-          <w:sz w:val="24"/>
-          <w:szCs w:val="24"/>
-          <w:highlight w:val="yellow"/>
-        </w:rPr>
-      </w:pPr>
-      <w:r>
-        <w:rPr>
-          <w:rFonts w:cs="Times New Roman"/>
-          <w:bCs/>
-          <w:sz w:val="24"/>
-          <w:szCs w:val="24"/>
-        </w:rPr>
-        <w:t>На рассматриваемой внутренней территории проходит газопровод:</w:t>
-      </w:r>
-    </w:p>
-    <w:p>
-      <w:pPr>
-        <w:rPr>
-          <w:rFonts w:cs="Times New Roman"/>
-          <w:bCs/>
-          <w:sz w:val="24"/>
-          <w:szCs w:val="24"/>
-          <w:highlight w:val="yellow"/>
-        </w:rPr>
-      </w:pPr>
-    </w:p>
-    <w:tbl>
-      <w:tblPr>
-        <w:tblW w:w="14175" w:type="dxa"/>
-        <w:tblInd w:w="108" w:type="dxa"/>
-        <w:tblBorders>
-          <w:top w:val="single" w:sz="4" w:space="0" w:color="auto"/>
-          <w:left w:val="single" w:sz="4" w:space="0" w:color="auto"/>
-          <w:bottom w:val="single" w:sz="4" w:space="0" w:color="auto"/>
-          <w:right w:val="single" w:sz="4" w:space="0" w:color="auto"/>
-          <w:insideH w:val="single" w:sz="4" w:space="0" w:color="auto"/>
-          <w:insideV w:val="single" w:sz="4" w:space="0" w:color="auto"/>
-        </w:tblBorders>
-        <w:tblLook w:val="04A0" w:firstRow="1" w:lastRow="0" w:firstColumn="1" w:lastColumn="0" w:noHBand="0" w:noVBand="1"/>
-      </w:tblPr>
-      <w:tblGrid>
-        <w:gridCol w:w="4678"/>
-        <w:gridCol w:w="2835"/>
-        <w:gridCol w:w="3119"/>
-        <w:gridCol w:w="3543"/>
-      </w:tblGrid>
-      <w:tr>
-        <w:trPr>
-          <w:trHeight w:val="390"/>
-        </w:trPr>
-        <w:tc>
-          <w:tcPr>
-            <w:tcW w:w="4678" w:type="dxa"/>
-            <w:shd w:val="clear" w:color="auto" w:fill="auto"/>
-            <w:noWrap/>
-            <w:vAlign w:val="bottom"/>
-            <w:hideMark/>
-          </w:tcPr>
-          <w:p>
-            <w:pPr>
-              <w:rPr>
-                <w:rFonts w:eastAsia="Times New Roman" w:cs="Times New Roman"/>
-                <w:b/>
-                <w:bCs/>
-                <w:color w:val="000000"/>
-                <w:sz w:val="24"/>
-                <w:szCs w:val="24"/>
-                <w:lang w:eastAsia="ru-RU"/>
-              </w:rPr>
-            </w:pPr>
-            <w:r>
-              <w:rPr>
-                <w:rFonts w:eastAsia="Times New Roman" w:cs="Times New Roman"/>
-                <w:b/>
-                <w:bCs/>
-                <w:color w:val="000000"/>
-                <w:sz w:val="24"/>
-                <w:szCs w:val="24"/>
-                <w:lang w:eastAsia="ru-RU"/>
-              </w:rPr>
-              <w:t>Внешний диаметр трубопровода</w:t>
-            </w:r>
-          </w:p>
-        </w:tc>
-        <w:tc>
-          <w:tcPr>
-            <w:tcW w:w="2835" w:type="dxa"/>
-            <w:shd w:val="clear" w:color="auto" w:fill="auto"/>
-            <w:noWrap/>
-            <w:vAlign w:val="bottom"/>
-            <w:hideMark/>
-          </w:tcPr>
-          <w:p>
-            <w:pPr>
-              <w:rPr>
-                <w:rFonts w:eastAsia="Times New Roman" w:cs="Times New Roman"/>
-                <w:b/>
-                <w:bCs/>
-                <w:color w:val="000000"/>
-                <w:sz w:val="24"/>
-                <w:szCs w:val="24"/>
-                <w:lang w:eastAsia="ru-RU"/>
-              </w:rPr>
-            </w:pPr>
-            <w:r>
-              <w:rPr>
-                <w:rFonts w:eastAsia="Times New Roman" w:cs="Times New Roman"/>
-                <w:b/>
-                <w:bCs/>
-                <w:color w:val="000000"/>
-                <w:sz w:val="24"/>
-                <w:szCs w:val="24"/>
-                <w:lang w:eastAsia="ru-RU"/>
-              </w:rPr>
-              <w:t>Толщина стенки</w:t>
-            </w:r>
-          </w:p>
-        </w:tc>
-        <w:tc>
-          <w:tcPr>
-            <w:tcW w:w="3119" w:type="dxa"/>
-            <w:shd w:val="clear" w:color="auto" w:fill="auto"/>
-            <w:noWrap/>
-            <w:vAlign w:val="bottom"/>
-            <w:hideMark/>
-          </w:tcPr>
-          <w:p>
-            <w:pPr>
-              <w:rPr>
-                <w:rFonts w:eastAsia="Times New Roman" w:cs="Times New Roman"/>
-                <w:b/>
-                <w:bCs/>
-                <w:color w:val="000000"/>
-                <w:sz w:val="24"/>
-                <w:szCs w:val="24"/>
-                <w:lang w:eastAsia="ru-RU"/>
-              </w:rPr>
-            </w:pPr>
-            <w:r>
-              <w:rPr>
-                <w:rFonts w:eastAsia="Times New Roman" w:cs="Times New Roman"/>
-                <w:b/>
-                <w:bCs/>
-                <w:color w:val="000000"/>
-                <w:sz w:val="24"/>
-                <w:szCs w:val="24"/>
-                <w:lang w:eastAsia="ru-RU"/>
-              </w:rPr>
-              <w:t>Внутренний диаметр</w:t>
-            </w:r>
-          </w:p>
-        </w:tc>
-        <w:tc>
-          <w:tcPr>
-            <w:tcW w:w="3543" w:type="dxa"/>
-            <w:shd w:val="clear" w:color="auto" w:fill="auto"/>
-            <w:noWrap/>
-            <w:vAlign w:val="bottom"/>
-            <w:hideMark/>
-          </w:tcPr>
-          <w:p>
-            <w:pPr>
-              <w:rPr>
-                <w:rFonts w:eastAsia="Times New Roman" w:cs="Times New Roman"/>
-                <w:b/>
-                <w:bCs/>
-                <w:color w:val="000000"/>
-                <w:sz w:val="24"/>
-                <w:szCs w:val="24"/>
-                <w:lang w:eastAsia="ru-RU"/>
-              </w:rPr>
-            </w:pPr>
-            <w:r>
-              <w:rPr>
-                <w:rFonts w:eastAsia="Times New Roman" w:cs="Times New Roman"/>
-                <w:b/>
-                <w:bCs/>
-                <w:color w:val="000000"/>
-                <w:sz w:val="24"/>
-                <w:szCs w:val="24"/>
-                <w:lang w:eastAsia="ru-RU"/>
-              </w:rPr>
-              <w:t>Длина участка трубопровода</w:t>
-            </w:r>
-          </w:p>
-        </w:tc>
-      </w:tr>
-      <w:tr>
-        <w:trPr>
-          <w:trHeight w:val="300"/>
-        </w:trPr>
-        <w:tc>
-          <w:tcPr>
-            <w:tcW w:w="4678" w:type="dxa"/>
-            <w:shd w:val="clear" w:color="auto" w:fill="auto"/>
-            <w:noWrap/>
-            <w:vAlign w:val="bottom"/>
-            <w:hideMark/>
-          </w:tcPr>
-          <w:p>
-            <w:pPr>
-              <w:rPr>
-                <w:rFonts w:cs="Times New Roman"/>
-                <w:color w:val="000000"/>
-                <w:sz w:val="24"/>
-                <w:szCs w:val="24"/>
-              </w:rPr>
-            </w:pPr>
-            <w:r>
-              <w:rPr>
-                <w:rFonts w:cs="Times New Roman"/>
-                <w:color w:val="000000"/>
-                <w:sz w:val="24"/>
-                <w:szCs w:val="24"/>
-              </w:rPr>
-              <w:t>0,089</w:t>
-            </w:r>
-          </w:p>
-        </w:tc>
-        <w:tc>
-          <w:tcPr>
-            <w:tcW w:w="2835" w:type="dxa"/>
-            <w:shd w:val="clear" w:color="auto" w:fill="auto"/>
-            <w:noWrap/>
-            <w:vAlign w:val="bottom"/>
-            <w:hideMark/>
-          </w:tcPr>
-          <w:p>
-            <w:pPr>
-              <w:rPr>
-                <w:rFonts w:cs="Times New Roman"/>
-                <w:color w:val="000000"/>
-                <w:sz w:val="24"/>
-                <w:szCs w:val="24"/>
-              </w:rPr>
-            </w:pPr>
-            <w:r>
-              <w:rPr>
-                <w:rFonts w:cs="Times New Roman"/>
-                <w:color w:val="000000"/>
-                <w:sz w:val="24"/>
-                <w:szCs w:val="24"/>
-              </w:rPr>
-              <w:t>0,004</w:t>
-            </w:r>
-          </w:p>
-        </w:tc>
-        <w:tc>
-          <w:tcPr>
-            <w:tcW w:w="3119" w:type="dxa"/>
-            <w:shd w:val="clear" w:color="auto" w:fill="auto"/>
-            <w:noWrap/>
-            <w:vAlign w:val="bottom"/>
-            <w:hideMark/>
-          </w:tcPr>
-          <w:p>
-            <w:pPr>
-              <w:rPr>
-                <w:rFonts w:cs="Times New Roman"/>
-                <w:color w:val="000000"/>
-                <w:sz w:val="24"/>
-                <w:szCs w:val="24"/>
-              </w:rPr>
-            </w:pPr>
-            <w:r>
-              <w:rPr>
-                <w:rFonts w:cs="Times New Roman"/>
-                <w:color w:val="000000"/>
-                <w:sz w:val="24"/>
-                <w:szCs w:val="24"/>
-              </w:rPr>
-              <w:t>0,085</w:t>
-            </w:r>
-          </w:p>
-        </w:tc>
-        <w:tc>
-          <w:tcPr>
-            <w:tcW w:w="3543" w:type="dxa"/>
-            <w:shd w:val="clear" w:color="auto" w:fill="auto"/>
-            <w:noWrap/>
-            <w:vAlign w:val="bottom"/>
-            <w:hideMark/>
-          </w:tcPr>
-          <w:p>
-            <w:pPr>
-              <w:rPr>
-                <w:rFonts w:cs="Times New Roman"/>
-                <w:color w:val="000000"/>
-                <w:sz w:val="24"/>
-                <w:szCs w:val="24"/>
-              </w:rPr>
-            </w:pPr>
-            <w:r>
-              <w:rPr>
-                <w:rFonts w:cs="Times New Roman"/>
-                <w:color w:val="000000"/>
-                <w:sz w:val="24"/>
-                <w:szCs w:val="24"/>
-              </w:rPr>
-              <w:t>47</w:t>
-            </w:r>
-          </w:p>
-        </w:tc>
-      </w:tr>
-      <w:tr>
-        <w:trPr>
-          <w:trHeight w:val="289"/>
-        </w:trPr>
-        <w:tc>
-          <w:tcPr>
-            <w:tcW w:w="4678" w:type="dxa"/>
-            <w:shd w:val="clear" w:color="auto" w:fill="auto"/>
-            <w:noWrap/>
-            <w:vAlign w:val="bottom"/>
-            <w:hideMark/>
-          </w:tcPr>
-          <w:p>
-            <w:pPr>
-              <w:rPr>
-                <w:rFonts w:cs="Times New Roman"/>
-                <w:color w:val="000000"/>
-                <w:sz w:val="24"/>
-                <w:szCs w:val="24"/>
-              </w:rPr>
-            </w:pPr>
-            <w:r>
-              <w:rPr>
-                <w:rFonts w:cs="Times New Roman"/>
-                <w:color w:val="000000"/>
-                <w:sz w:val="24"/>
-                <w:szCs w:val="24"/>
-              </w:rPr>
-              <w:t>0,133</w:t>
-            </w:r>
-          </w:p>
-        </w:tc>
-        <w:tc>
-          <w:tcPr>
-            <w:tcW w:w="2835" w:type="dxa"/>
-            <w:shd w:val="clear" w:color="auto" w:fill="auto"/>
-            <w:noWrap/>
-            <w:vAlign w:val="bottom"/>
-            <w:hideMark/>
-          </w:tcPr>
-          <w:p>
-            <w:pPr>
-              <w:rPr>
-                <w:rFonts w:cs="Times New Roman"/>
-                <w:color w:val="000000"/>
-                <w:sz w:val="24"/>
-                <w:szCs w:val="24"/>
-              </w:rPr>
-            </w:pPr>
-            <w:r>
-              <w:rPr>
-                <w:rFonts w:cs="Times New Roman"/>
-                <w:color w:val="000000"/>
-                <w:sz w:val="24"/>
-                <w:szCs w:val="24"/>
-              </w:rPr>
-              <w:t>0,004</w:t>
-            </w:r>
-          </w:p>
-        </w:tc>
-        <w:tc>
-          <w:tcPr>
-            <w:tcW w:w="3119" w:type="dxa"/>
-            <w:shd w:val="clear" w:color="auto" w:fill="auto"/>
-            <w:noWrap/>
-            <w:vAlign w:val="bottom"/>
-            <w:hideMark/>
-          </w:tcPr>
-          <w:p>
-            <w:pPr>
-              <w:rPr>
-                <w:rFonts w:cs="Times New Roman"/>
-                <w:color w:val="000000"/>
-                <w:sz w:val="24"/>
-                <w:szCs w:val="24"/>
-              </w:rPr>
-            </w:pPr>
-            <w:r>
-              <w:rPr>
-                <w:rFonts w:cs="Times New Roman"/>
-                <w:color w:val="000000"/>
-                <w:sz w:val="24"/>
-                <w:szCs w:val="24"/>
-              </w:rPr>
-              <w:t>0,129</w:t>
-            </w:r>
-          </w:p>
-        </w:tc>
-        <w:tc>
-          <w:tcPr>
-            <w:tcW w:w="3543" w:type="dxa"/>
-            <w:shd w:val="clear" w:color="auto" w:fill="auto"/>
-            <w:noWrap/>
-            <w:vAlign w:val="bottom"/>
-            <w:hideMark/>
-          </w:tcPr>
-          <w:p>
-            <w:pPr>
-              <w:rPr>
-                <w:rFonts w:cs="Times New Roman"/>
-                <w:color w:val="000000"/>
-                <w:sz w:val="24"/>
-                <w:szCs w:val="24"/>
-              </w:rPr>
-            </w:pPr>
-            <w:r>
-              <w:rPr>
-                <w:rFonts w:cs="Times New Roman"/>
-                <w:color w:val="000000"/>
-                <w:sz w:val="24"/>
-                <w:szCs w:val="24"/>
-              </w:rPr>
-              <w:t>71</w:t>
-            </w:r>
-          </w:p>
-        </w:tc>
-      </w:tr>
-      <w:tr>
-        <w:trPr>
-          <w:trHeight w:val="289"/>
-        </w:trPr>
-        <w:tc>
-          <w:tcPr>
-            <w:tcW w:w="4678" w:type="dxa"/>
-            <w:shd w:val="clear" w:color="auto" w:fill="auto"/>
-            <w:noWrap/>
-            <w:vAlign w:val="bottom"/>
-            <w:hideMark/>
-          </w:tcPr>
-          <w:p>
-            <w:pPr>
-              <w:rPr>
-                <w:rFonts w:cs="Times New Roman"/>
-                <w:color w:val="000000"/>
-                <w:sz w:val="24"/>
-                <w:szCs w:val="24"/>
-              </w:rPr>
-            </w:pPr>
-            <w:r>
-              <w:rPr>
-                <w:rFonts w:cs="Times New Roman"/>
-                <w:color w:val="000000"/>
-                <w:sz w:val="24"/>
-                <w:szCs w:val="24"/>
-              </w:rPr>
-              <w:t>0,108</w:t>
-            </w:r>
-          </w:p>
-        </w:tc>
-        <w:tc>
-          <w:tcPr>
-            <w:tcW w:w="2835" w:type="dxa"/>
-            <w:shd w:val="clear" w:color="auto" w:fill="auto"/>
-            <w:noWrap/>
-            <w:vAlign w:val="bottom"/>
-            <w:hideMark/>
-          </w:tcPr>
-          <w:p>
-            <w:pPr>
-              <w:rPr>
-                <w:rFonts w:cs="Times New Roman"/>
-                <w:color w:val="000000"/>
-                <w:sz w:val="24"/>
-                <w:szCs w:val="24"/>
-              </w:rPr>
-            </w:pPr>
-            <w:r>
-              <w:rPr>
-                <w:rFonts w:cs="Times New Roman"/>
-                <w:color w:val="000000"/>
-                <w:sz w:val="24"/>
-                <w:szCs w:val="24"/>
-              </w:rPr>
-              <w:t>0,004</w:t>
-            </w:r>
-          </w:p>
-        </w:tc>
-        <w:tc>
-          <w:tcPr>
-            <w:tcW w:w="3119" w:type="dxa"/>
-            <w:shd w:val="clear" w:color="auto" w:fill="auto"/>
-            <w:noWrap/>
-            <w:vAlign w:val="bottom"/>
-            <w:hideMark/>
-          </w:tcPr>
-          <w:p>
-            <w:pPr>
-              <w:rPr>
-                <w:rFonts w:cs="Times New Roman"/>
-                <w:color w:val="000000"/>
-                <w:sz w:val="24"/>
-                <w:szCs w:val="24"/>
-              </w:rPr>
-            </w:pPr>
-            <w:r>
-              <w:rPr>
-                <w:rFonts w:cs="Times New Roman"/>
-                <w:color w:val="000000"/>
-                <w:sz w:val="24"/>
-                <w:szCs w:val="24"/>
-              </w:rPr>
-              <w:t>0,104</w:t>
-            </w:r>
-          </w:p>
-        </w:tc>
-        <w:tc>
-          <w:tcPr>
-            <w:tcW w:w="3543" w:type="dxa"/>
-            <w:shd w:val="clear" w:color="auto" w:fill="auto"/>
-            <w:noWrap/>
-            <w:vAlign w:val="bottom"/>
-            <w:hideMark/>
-          </w:tcPr>
-          <w:p>
-            <w:pPr>
-              <w:rPr>
-                <w:rFonts w:cs="Times New Roman"/>
-                <w:color w:val="000000"/>
-                <w:sz w:val="24"/>
-                <w:szCs w:val="24"/>
-              </w:rPr>
-            </w:pPr>
-            <w:r>
-              <w:rPr>
-                <w:rFonts w:cs="Times New Roman"/>
-                <w:color w:val="000000"/>
-                <w:sz w:val="24"/>
-                <w:szCs w:val="24"/>
-              </w:rPr>
-              <w:t>9</w:t>
-            </w:r>
-          </w:p>
-        </w:tc>
-      </w:tr>
-    </w:tbl>
-    <w:p>
-      <w:pPr>
-        <w:rPr>
-          <w:rFonts w:cs="Times New Roman"/>
-          <w:bCs/>
-          <w:sz w:val="24"/>
-          <w:szCs w:val="24"/>
-        </w:rPr>
-      </w:pPr>
-    </w:p>
-    <w:p>
-      <w:pPr>
-        <w:rPr>
-          <w:rFonts w:cs="Times New Roman"/>
-          <w:bCs/>
-          <w:sz w:val="24"/>
-          <w:szCs w:val="24"/>
-          <w:highlight w:val="yellow"/>
-        </w:rPr>
-      </w:pPr>
-      <w:r>
-        <w:rPr>
-          <w:rFonts w:cs="Times New Roman"/>
-          <w:bCs/>
-          <w:sz w:val="24"/>
-          <w:szCs w:val="24"/>
-        </w:rPr>
-        <w:t>P = 30 КПа.</w:t>
-      </w:r>
-    </w:p>
-    <w:p>
-      <w:pPr>
-        <w:rPr>
-          <w:rFonts w:cs="Times New Roman"/>
-          <w:sz w:val="24"/>
-          <w:szCs w:val="24"/>
-          <w:highlight w:val="yellow"/>
-        </w:rPr>
-      </w:pPr>
-    </w:p>
-    <w:p>
-      <w:pPr>
-        <w:rPr>
-          <w:rFonts w:cs="Times New Roman"/>
-          <w:sz w:val="24"/>
-          <w:szCs w:val="24"/>
-          <w:highlight w:val="yellow"/>
-        </w:rPr>
-      </w:pPr>
-      <w:r>
-        <w:rPr>
-          <w:rFonts w:cs="Times New Roman"/>
-          <w:sz w:val="24"/>
-          <w:szCs w:val="24"/>
-        </w:rPr>
-        <w:t>Аварии при разгерметизации газопровода сопровождается следующими процессами и событиями:</w:t>
-      </w:r>
-    </w:p>
-    <w:p>
-      <w:pPr>
-        <w:rPr>
-          <w:rFonts w:cs="Times New Roman"/>
-          <w:sz w:val="24"/>
-          <w:szCs w:val="24"/>
-          <w:highlight w:val="yellow"/>
-        </w:rPr>
-      </w:pPr>
-      <w:r>
-        <w:rPr>
-          <w:rFonts w:cs="Times New Roman"/>
-          <w:sz w:val="24"/>
-          <w:szCs w:val="24"/>
-        </w:rPr>
-        <w:t>- Разрыв (разгерметизация) трубопровода;</w:t>
-      </w:r>
-    </w:p>
-    <w:p>
-      <w:pPr>
-        <w:rPr>
-          <w:rFonts w:cs="Times New Roman"/>
-          <w:sz w:val="24"/>
-          <w:szCs w:val="24"/>
-          <w:highlight w:val="yellow"/>
-        </w:rPr>
-      </w:pPr>
-      <w:r>
-        <w:rPr>
-          <w:rFonts w:cs="Times New Roman"/>
-          <w:sz w:val="24"/>
-          <w:szCs w:val="24"/>
-        </w:rPr>
-        <w:t>- Истечением газа до срабатывания отсекающей арматуры (импульсом на закрытие арматуры является снижение давления продукта);</w:t>
-      </w:r>
-    </w:p>
-    <w:p>
-      <w:pPr>
-        <w:rPr>
-          <w:rFonts w:cs="Times New Roman"/>
-          <w:sz w:val="24"/>
-          <w:szCs w:val="24"/>
-          <w:highlight w:val="yellow"/>
-        </w:rPr>
-      </w:pPr>
-      <w:r>
-        <w:rPr>
-          <w:rFonts w:cs="Times New Roman"/>
-          <w:sz w:val="24"/>
-          <w:szCs w:val="24"/>
-        </w:rPr>
-        <w:t>- Закрытие отсекающей арматуры, истечение газа из участка трубопровода, отсеченного арматурой.</w:t>
-      </w:r>
-    </w:p>
-    <w:p>
-      <w:pPr>
-        <w:rPr>
-          <w:rFonts w:cs="Times New Roman"/>
-          <w:sz w:val="24"/>
-          <w:szCs w:val="24"/>
-          <w:highlight w:val="yellow"/>
-        </w:rPr>
-      </w:pPr>
-      <w:r>
-        <w:rPr>
-          <w:rFonts w:cs="Times New Roman"/>
-          <w:sz w:val="24"/>
-          <w:szCs w:val="24"/>
-        </w:rPr>
-        <w:t>- В местах повреждения происходит истечение газа под высоким давлением в окружающую среду. Смешиваясь с воздухом, газ образует облако взрывоопасной смеси.</w:t>
-      </w:r>
-    </w:p>
-    <w:p>
-      <w:pPr>
-        <w:rPr>
-          <w:rFonts w:cs="Times New Roman"/>
-          <w:sz w:val="24"/>
-          <w:szCs w:val="24"/>
-          <w:highlight w:val="yellow"/>
-        </w:rPr>
-      </w:pPr>
-    </w:p>
-    <w:p>
-      <w:pPr>
-        <w:rPr>
-          <w:rFonts w:cs="Times New Roman"/>
-          <w:sz w:val="24"/>
-          <w:szCs w:val="24"/>
-        </w:rPr>
-      </w:pPr>
-      <w:r>
-        <w:rPr>
-          <w:rFonts w:cs="Times New Roman"/>
-          <w:sz w:val="24"/>
-          <w:szCs w:val="24"/>
-        </w:rPr>
-        <w:t>Массовый секундный расход газа М из газопровода для критического режима истечения, когда основные его параметры (расход и скорость истечения) зависят только от параметров разгерметизированного трубопровода, может быть определен по формуле</w:t>
-      </w:r>
-    </w:p>
-    <w:p>
-      <w:pPr>
-        <w:rPr>
-          <w:rFonts w:cs="Times New Roman"/>
-          <w:sz w:val="24"/>
-          <w:szCs w:val="24"/>
-        </w:rPr>
-      </w:pPr>
-    </w:p>
-    <w:p>
-      <w:pPr>
-        <w:rPr>
-          <w:rFonts w:cs="Times New Roman"/>
-          <w:sz w:val="24"/>
-          <w:szCs w:val="24"/>
-          <w:vertAlign w:val="superscript"/>
-        </w:rPr>
-      </w:pPr>
-      <w:r>
-        <w:rPr>
-          <w:rFonts w:cs="Times New Roman"/>
-          <w:sz w:val="24"/>
-          <w:szCs w:val="24"/>
-        </w:rPr>
-        <w:t xml:space="preserve">М = Ψ × </w:t>
-      </w:r>
-      <w:r>
-        <w:rPr>
-          <w:rFonts w:cs="Times New Roman"/>
-          <w:sz w:val="24"/>
-          <w:szCs w:val="24"/>
-          <w:lang w:val="en-US"/>
-        </w:rPr>
-        <w:t>F</w:t>
-      </w:r>
-      <w:r>
-        <w:rPr>
-          <w:rFonts w:cs="Times New Roman"/>
-          <w:sz w:val="24"/>
-          <w:szCs w:val="24"/>
-        </w:rPr>
-        <w:t xml:space="preserve"> × µ × (Р</w:t>
-      </w:r>
-      <w:r>
-        <w:rPr>
-          <w:rFonts w:cs="Times New Roman"/>
-          <w:sz w:val="24"/>
-          <w:szCs w:val="24"/>
-          <w:vertAlign w:val="subscript"/>
-        </w:rPr>
-        <w:t>г</w:t>
-      </w:r>
-      <w:r>
-        <w:rPr>
-          <w:rFonts w:cs="Times New Roman"/>
-          <w:sz w:val="24"/>
-          <w:szCs w:val="24"/>
-        </w:rPr>
-        <w:t>/V</w:t>
-      </w:r>
-      <w:r>
-        <w:rPr>
-          <w:rFonts w:cs="Times New Roman"/>
-          <w:sz w:val="24"/>
-          <w:szCs w:val="24"/>
-          <w:vertAlign w:val="subscript"/>
-        </w:rPr>
-        <w:t>г</w:t>
-      </w:r>
-      <w:r>
-        <w:rPr>
-          <w:rFonts w:cs="Times New Roman"/>
-          <w:sz w:val="24"/>
-          <w:szCs w:val="24"/>
-        </w:rPr>
-        <w:t>)</w:t>
-      </w:r>
-      <w:r>
-        <w:rPr>
-          <w:rFonts w:cs="Times New Roman"/>
-          <w:sz w:val="24"/>
-          <w:szCs w:val="24"/>
-          <w:vertAlign w:val="superscript"/>
-        </w:rPr>
-        <w:t>1/2</w:t>
-      </w:r>
-      <w:r>
-        <w:rPr>
-          <w:rFonts w:cs="Times New Roman"/>
-          <w:sz w:val="24"/>
-          <w:szCs w:val="24"/>
-        </w:rPr>
-        <w:t>,</w:t>
-      </w:r>
-      <w:r>
-        <w:rPr>
-          <w:rFonts w:cs="Times New Roman"/>
-          <w:sz w:val="24"/>
-          <w:szCs w:val="24"/>
-        </w:rPr>
-        <w:tab/>
-      </w:r>
-      <w:r>
-        <w:rPr>
-          <w:rFonts w:cs="Times New Roman"/>
-          <w:sz w:val="24"/>
-          <w:szCs w:val="24"/>
-        </w:rPr>
-        <w:tab/>
-        <w:t xml:space="preserve">М = </w:t>
-      </w:r>
-      <w:r>
-        <w:rPr>
-          <w:rFonts w:cs="Times New Roman"/>
-          <w:sz w:val="24"/>
-          <w:szCs w:val="24"/>
-        </w:rPr>
-        <w:t>0</w:t>
-      </w:r>
-      <w:r>
-        <w:rPr>
-          <w:rFonts w:cs="Times New Roman"/>
-          <w:sz w:val="24"/>
-          <w:szCs w:val="24"/>
-        </w:rPr>
-        <w:t>,</w:t>
-      </w:r>
-      <w:r>
-        <w:rPr>
-          <w:rFonts w:cs="Times New Roman"/>
-          <w:sz w:val="24"/>
-          <w:szCs w:val="24"/>
-        </w:rPr>
-        <w:t>404</w:t>
-      </w:r>
-      <w:r>
-        <w:rPr>
-          <w:rFonts w:cs="Times New Roman"/>
-          <w:sz w:val="24"/>
-          <w:szCs w:val="24"/>
-        </w:rPr>
-        <w:t xml:space="preserve"> кг/</w:t>
-      </w:r>
-      <w:r>
-        <w:rPr>
-          <w:rFonts w:cs="Times New Roman"/>
-          <w:sz w:val="24"/>
-          <w:szCs w:val="24"/>
-          <w:lang w:val="en-US"/>
-        </w:rPr>
-        <w:t>c</w:t>
-      </w:r>
-      <w:r>
-        <w:rPr>
-          <w:rFonts w:cs="Times New Roman"/>
-          <w:sz w:val="24"/>
-          <w:szCs w:val="24"/>
-        </w:rPr>
-        <w:t xml:space="preserve">ек.                     </w:t>
-      </w:r>
-      <w:r>
-        <w:rPr>
-          <w:rFonts w:cs="Times New Roman"/>
-          <w:sz w:val="24"/>
-          <w:szCs w:val="24"/>
-          <w:lang w:val="en-US"/>
-        </w:rPr>
-        <w:t>F</w:t>
-      </w:r>
-      <w:r>
-        <w:rPr>
-          <w:rFonts w:cs="Times New Roman"/>
-          <w:sz w:val="24"/>
-          <w:szCs w:val="24"/>
-        </w:rPr>
-        <w:t xml:space="preserve"> =  π × </w:t>
-      </w:r>
-      <w:r>
-        <w:rPr>
-          <w:rFonts w:cs="Times New Roman"/>
-          <w:sz w:val="24"/>
-          <w:szCs w:val="24"/>
-          <w:lang w:val="en-US"/>
-        </w:rPr>
-        <w:t>d</w:t>
-      </w:r>
-      <w:r>
-        <w:rPr>
-          <w:rFonts w:cs="Times New Roman"/>
-          <w:sz w:val="24"/>
-          <w:szCs w:val="24"/>
-          <w:vertAlign w:val="superscript"/>
-        </w:rPr>
-        <w:t>2</w:t>
-      </w:r>
-      <w:r>
-        <w:rPr>
-          <w:rFonts w:cs="Times New Roman"/>
-          <w:sz w:val="24"/>
-          <w:szCs w:val="24"/>
-        </w:rPr>
-        <w:t>/4,</w:t>
-      </w:r>
-      <w:r>
-        <w:rPr>
-          <w:rFonts w:cs="Times New Roman"/>
-          <w:sz w:val="24"/>
-          <w:szCs w:val="24"/>
-        </w:rPr>
-        <w:tab/>
-      </w:r>
-      <w:r>
-        <w:rPr>
-          <w:rFonts w:cs="Times New Roman"/>
-          <w:sz w:val="24"/>
-          <w:szCs w:val="24"/>
-        </w:rPr>
-        <w:tab/>
-      </w:r>
-      <w:r>
-        <w:rPr>
-          <w:rFonts w:cs="Times New Roman"/>
-          <w:sz w:val="24"/>
-          <w:szCs w:val="24"/>
-        </w:rPr>
-        <w:tab/>
-      </w:r>
-      <w:r>
-        <w:rPr>
-          <w:rFonts w:cs="Times New Roman"/>
-          <w:sz w:val="24"/>
-          <w:szCs w:val="24"/>
-          <w:lang w:val="en-US"/>
-        </w:rPr>
-        <w:t>F</w:t>
-      </w:r>
-      <w:r>
-        <w:rPr>
-          <w:rFonts w:cs="Times New Roman"/>
-          <w:sz w:val="24"/>
-          <w:szCs w:val="24"/>
-        </w:rPr>
-        <w:t xml:space="preserve"> =  0,00</w:t>
-      </w:r>
-      <w:r>
-        <w:rPr>
-          <w:rFonts w:cs="Times New Roman"/>
-          <w:sz w:val="24"/>
-          <w:szCs w:val="24"/>
-        </w:rPr>
-        <w:t>56</w:t>
-      </w:r>
-      <w:r>
-        <w:rPr>
-          <w:rFonts w:cs="Times New Roman"/>
-          <w:sz w:val="24"/>
-          <w:szCs w:val="24"/>
-        </w:rPr>
-        <w:t xml:space="preserve"> м</w:t>
-      </w:r>
-      <w:r>
-        <w:rPr>
-          <w:rFonts w:cs="Times New Roman"/>
-          <w:sz w:val="24"/>
-          <w:szCs w:val="24"/>
-          <w:vertAlign w:val="superscript"/>
-        </w:rPr>
-        <w:t>2</w:t>
-      </w:r>
-    </w:p>
-    <w:p>
-      <w:pPr>
-        <w:rPr>
-          <w:rFonts w:cs="Times New Roman"/>
-          <w:sz w:val="24"/>
-          <w:szCs w:val="24"/>
-        </w:rPr>
-      </w:pPr>
-    </w:p>
-    <w:p>
-      <w:pPr>
-        <w:rPr>
-          <w:rFonts w:cs="Times New Roman"/>
-          <w:sz w:val="24"/>
-          <w:szCs w:val="24"/>
-        </w:rPr>
-      </w:pPr>
-      <w:r>
-        <w:rPr>
-          <w:rFonts w:cs="Times New Roman"/>
-          <w:sz w:val="24"/>
-          <w:szCs w:val="24"/>
-        </w:rPr>
-        <w:t xml:space="preserve">где Ψ - коэффициент, учитывающий расход газа от состояния потока (для звуковой скорости истечения Ψ =0,7); </w:t>
-      </w:r>
-    </w:p>
-    <w:p>
-      <w:pPr>
-        <w:rPr>
-          <w:rFonts w:cs="Times New Roman"/>
-          <w:sz w:val="24"/>
-          <w:szCs w:val="24"/>
-        </w:rPr>
-      </w:pPr>
-      <w:r>
-        <w:rPr>
-          <w:rFonts w:cs="Times New Roman"/>
-          <w:sz w:val="24"/>
-          <w:szCs w:val="24"/>
-        </w:rPr>
-        <w:t>F - площадь отверстия истечения, принимаемая равной площади сечения трубопровода, м</w:t>
-      </w:r>
-      <w:r>
-        <w:rPr>
-          <w:rFonts w:cs="Times New Roman"/>
-          <w:sz w:val="24"/>
-          <w:szCs w:val="24"/>
-          <w:vertAlign w:val="superscript"/>
-        </w:rPr>
-        <w:t>2</w:t>
-      </w:r>
-      <w:r>
-        <w:rPr>
-          <w:rFonts w:cs="Times New Roman"/>
-          <w:sz w:val="24"/>
-          <w:szCs w:val="24"/>
-        </w:rPr>
-        <w:t>; </w:t>
-      </w:r>
-    </w:p>
-    <w:p>
-      <w:pPr>
-        <w:rPr>
-          <w:rFonts w:cs="Times New Roman"/>
-          <w:sz w:val="24"/>
-          <w:szCs w:val="24"/>
-        </w:rPr>
-      </w:pPr>
-      <w:r>
-        <w:rPr>
-          <w:rFonts w:cs="Times New Roman"/>
-          <w:sz w:val="24"/>
-          <w:szCs w:val="24"/>
-        </w:rPr>
-        <w:t>µ - коэффициент расхода, учитывает форму отверстия (m = 0,7 - 0,9), в расчетах принимается µ = 0,8; Р</w:t>
-      </w:r>
-      <w:r>
-        <w:rPr>
-          <w:rFonts w:cs="Times New Roman"/>
-          <w:sz w:val="24"/>
-          <w:szCs w:val="24"/>
-          <w:vertAlign w:val="subscript"/>
-        </w:rPr>
-        <w:t>г</w:t>
-      </w:r>
-      <w:r>
-        <w:rPr>
-          <w:rFonts w:cs="Times New Roman"/>
-          <w:sz w:val="24"/>
-          <w:szCs w:val="24"/>
-        </w:rPr>
-        <w:t> </w:t>
-      </w:r>
-    </w:p>
-    <w:p>
-      <w:pPr>
-        <w:rPr>
-          <w:rFonts w:cs="Times New Roman"/>
-          <w:sz w:val="24"/>
-          <w:szCs w:val="24"/>
-        </w:rPr>
-      </w:pPr>
-      <w:r>
-        <w:rPr>
-          <w:rFonts w:cs="Times New Roman"/>
-          <w:sz w:val="24"/>
-          <w:szCs w:val="24"/>
-        </w:rPr>
-        <w:t>Р</w:t>
-      </w:r>
-      <w:r>
-        <w:rPr>
-          <w:rFonts w:cs="Times New Roman"/>
-          <w:sz w:val="24"/>
-          <w:szCs w:val="24"/>
-          <w:vertAlign w:val="subscript"/>
-        </w:rPr>
-        <w:t>г</w:t>
-      </w:r>
-      <w:r>
-        <w:rPr>
-          <w:rFonts w:cs="Times New Roman"/>
-          <w:sz w:val="24"/>
-          <w:szCs w:val="24"/>
-        </w:rPr>
-        <w:t xml:space="preserve"> - давление газа в газопроводе, Па; </w:t>
-      </w:r>
-    </w:p>
-    <w:p>
-      <w:pPr>
-        <w:rPr>
-          <w:rFonts w:cs="Times New Roman"/>
-          <w:sz w:val="24"/>
-          <w:szCs w:val="24"/>
-        </w:rPr>
-      </w:pPr>
-      <w:r>
-        <w:rPr>
-          <w:rFonts w:cs="Times New Roman"/>
-          <w:sz w:val="24"/>
-          <w:szCs w:val="24"/>
-        </w:rPr>
-        <w:t>V</w:t>
-      </w:r>
-      <w:r>
-        <w:rPr>
-          <w:rFonts w:cs="Times New Roman"/>
-          <w:sz w:val="24"/>
-          <w:szCs w:val="24"/>
-          <w:vertAlign w:val="subscript"/>
-        </w:rPr>
-        <w:t>г</w:t>
-      </w:r>
-      <w:r>
-        <w:rPr>
-          <w:rFonts w:cs="Times New Roman"/>
-          <w:sz w:val="24"/>
-          <w:szCs w:val="24"/>
-        </w:rPr>
-        <w:t> - удельный объем транспортируемого газа при параметрах в газопроводе, определяется по формуле:</w:t>
-      </w:r>
-    </w:p>
-    <w:p>
-      <w:pPr>
-        <w:rPr>
-          <w:rFonts w:cs="Times New Roman"/>
-          <w:sz w:val="24"/>
-          <w:szCs w:val="24"/>
-        </w:rPr>
-      </w:pPr>
-    </w:p>
-    <w:p>
-      <w:pPr>
-        <w:rPr>
-          <w:rFonts w:cs="Times New Roman"/>
-          <w:sz w:val="24"/>
-          <w:szCs w:val="24"/>
-        </w:rPr>
-      </w:pPr>
-      <w:r>
-        <w:rPr>
-          <w:rFonts w:cs="Times New Roman"/>
-          <w:sz w:val="24"/>
-          <w:szCs w:val="24"/>
-        </w:rPr>
-        <w:t xml:space="preserve">Масса топлива, поступающего в котельную, при давлении 30 кПа за 1 секунду составляет величину </w:t>
-      </w:r>
-      <w:r>
-        <w:rPr>
-          <w:rFonts w:eastAsia="Times New Roman" w:cs="Times New Roman"/>
-          <w:color w:val="000000"/>
-          <w:sz w:val="24"/>
-          <w:szCs w:val="24"/>
-          <w:lang w:eastAsia="ru-RU"/>
-        </w:rPr>
-        <w:t>0,</w:t>
-      </w:r>
-      <w:r>
-        <w:rPr>
-          <w:rFonts w:eastAsia="Times New Roman" w:cs="Times New Roman"/>
-          <w:color w:val="000000"/>
-          <w:sz w:val="24"/>
-          <w:szCs w:val="24"/>
-          <w:lang w:eastAsia="ru-RU"/>
-        </w:rPr>
-        <w:t>404</w:t>
-      </w:r>
-      <w:r>
-        <w:rPr>
-          <w:rFonts w:eastAsia="Times New Roman" w:cs="Times New Roman"/>
-          <w:color w:val="000000"/>
-          <w:sz w:val="24"/>
-          <w:szCs w:val="24"/>
-          <w:lang w:eastAsia="ru-RU"/>
-        </w:rPr>
-        <w:t xml:space="preserve"> </w:t>
-      </w:r>
-      <w:r>
-        <w:rPr>
-          <w:rFonts w:cs="Times New Roman"/>
-          <w:sz w:val="24"/>
-          <w:szCs w:val="24"/>
-        </w:rPr>
-        <w:t>кг.</w:t>
-      </w:r>
-    </w:p>
-    <w:p>
-      <w:pPr>
-        <w:rPr>
-          <w:rFonts w:cs="Times New Roman"/>
-          <w:sz w:val="24"/>
-          <w:szCs w:val="24"/>
-        </w:rPr>
-      </w:pPr>
-    </w:p>
-    <w:p>
-      <w:pPr>
-        <w:ind w:firstLine="225"/>
-        <w:rPr>
-          <w:rFonts w:cs="Times New Roman"/>
-          <w:sz w:val="24"/>
-          <w:szCs w:val="24"/>
-        </w:rPr>
-      </w:pPr>
-      <w:r>
-        <w:rPr>
-          <w:rFonts w:cs="Times New Roman"/>
-          <w:sz w:val="24"/>
-          <w:szCs w:val="24"/>
-        </w:rPr>
-        <w:t>Запорная арматура находится в котельной, отключение автоматическое, резервирование имеется, расчетное время прекращения подачи топлива из магистрального трубопровода принимается 1 секунда. Объем поступлений газа в помещение котельной рассчитывается из суммы объемов газа, находящегося во внутреннем трубопроводе (V</w:t>
-      </w:r>
-      <w:r>
-        <w:rPr>
-          <w:rFonts w:cs="Times New Roman"/>
-          <w:sz w:val="24"/>
-          <w:szCs w:val="24"/>
-          <w:vertAlign w:val="subscript"/>
-        </w:rPr>
-        <w:t>1Т</w:t>
-      </w:r>
-      <w:r>
-        <w:rPr>
-          <w:rFonts w:cs="Times New Roman"/>
-          <w:sz w:val="24"/>
-          <w:szCs w:val="24"/>
-        </w:rPr>
-        <w:t>).</w:t>
-      </w:r>
-    </w:p>
-    <w:p>
-      <w:pPr>
-        <w:tabs>
-          <w:tab w:val="center" w:pos="4677"/>
-          <w:tab w:val="left" w:pos="7340"/>
-        </w:tabs>
-        <w:spacing w:line="360" w:lineRule="auto"/>
-        <w:jc w:val="both"/>
-        <w:rPr>
-          <w:rFonts w:eastAsia="Times New Roman" w:cs="Times New Roman"/>
-          <w:noProof/>
-          <w:sz w:val="24"/>
-          <w:szCs w:val="24"/>
-          <w:lang w:eastAsia="en-US"/>
-        </w:rPr>
-      </w:pPr>
-      <w:r>
-        <w:rPr>
-          <w:rFonts w:eastAsia="Times New Roman" w:cs="Times New Roman"/>
-          <w:noProof/>
-          <w:sz w:val="24"/>
-          <w:szCs w:val="24"/>
-          <w:lang w:eastAsia="en-US"/>
-        </w:rPr>
-        <w:t>Масса газа вышедшего из трубопровода за время отключения подачи газа (</w:t>
-      </w:r>
-      <w:r>
-        <w:rPr>
-          <w:rFonts w:eastAsia="Times New Roman" w:cs="Times New Roman"/>
-          <w:i/>
-          <w:noProof/>
-          <w:sz w:val="24"/>
-          <w:szCs w:val="24"/>
-          <w:lang w:val="en-US" w:eastAsia="en-US"/>
-        </w:rPr>
-        <w:t>T</w:t>
-      </w:r>
-      <w:r>
-        <w:rPr>
-          <w:rFonts w:eastAsia="Times New Roman" w:cs="Times New Roman"/>
-          <w:noProof/>
-          <w:sz w:val="24"/>
-          <w:szCs w:val="24"/>
-          <w:lang w:eastAsia="en-US"/>
-        </w:rPr>
-        <w:t>=1 секунда):</w:t>
-      </w:r>
-    </w:p>
-    <w:p>
-      <w:pPr>
-        <w:rPr>
-          <w:rFonts w:eastAsia="Times New Roman" w:cs="Times New Roman"/>
-          <w:noProof/>
-          <w:sz w:val="24"/>
-          <w:szCs w:val="24"/>
-          <w:lang w:eastAsia="en-US"/>
-        </w:rPr>
-      </w:pPr>
-      <w:r>
-        <w:rPr>
-          <w:rFonts w:eastAsia="Times New Roman" w:cs="Times New Roman"/>
-          <w:i/>
-          <w:noProof/>
-          <w:sz w:val="24"/>
-          <w:szCs w:val="24"/>
-          <w:lang w:val="en-US" w:eastAsia="en-US"/>
-        </w:rPr>
-        <w:t>M</w:t>
-      </w:r>
-      <w:r>
-        <w:rPr>
-          <w:rFonts w:eastAsia="Times New Roman" w:cs="Times New Roman"/>
-          <w:noProof/>
-          <w:sz w:val="24"/>
-          <w:szCs w:val="24"/>
-          <w:vertAlign w:val="subscript"/>
-          <w:lang w:eastAsia="en-US"/>
-        </w:rPr>
-        <w:t>1Т</w:t>
-      </w:r>
-      <w:r>
-        <w:rPr>
-          <w:rFonts w:eastAsia="Times New Roman" w:cs="Times New Roman"/>
-          <w:noProof/>
-          <w:sz w:val="24"/>
-          <w:szCs w:val="24"/>
-          <w:lang w:eastAsia="en-US"/>
-        </w:rPr>
-        <w:t xml:space="preserve"> = </w:t>
-      </w:r>
-      <w:r>
-        <w:rPr>
-          <w:rFonts w:eastAsia="Times New Roman" w:cs="Times New Roman"/>
-          <w:i/>
-          <w:noProof/>
-          <w:sz w:val="24"/>
-          <w:szCs w:val="24"/>
-          <w:lang w:val="en-US" w:eastAsia="en-US"/>
-        </w:rPr>
-        <w:t>M</w:t>
-      </w:r>
-      <w:r>
-        <w:rPr>
-          <w:rFonts w:eastAsia="Times New Roman" w:cs="Times New Roman"/>
-          <w:i/>
-          <w:noProof/>
-          <w:sz w:val="24"/>
-          <w:szCs w:val="24"/>
-          <w:lang w:eastAsia="en-US"/>
-        </w:rPr>
-        <w:t>∙T</w:t>
-      </w:r>
-      <w:r>
-        <w:rPr>
-          <w:rFonts w:eastAsia="Times New Roman" w:cs="Times New Roman"/>
-          <w:noProof/>
-          <w:sz w:val="24"/>
-          <w:szCs w:val="24"/>
-          <w:lang w:eastAsia="en-US"/>
-        </w:rPr>
-        <w:t xml:space="preserve"> = 0,</w:t>
-      </w:r>
-      <w:r>
-        <w:rPr>
-          <w:rFonts w:cs="Times New Roman"/>
-          <w:sz w:val="24"/>
-          <w:szCs w:val="24"/>
-        </w:rPr>
-        <w:t xml:space="preserve">404 ×1 </w:t>
-      </w:r>
-      <w:r>
-        <w:rPr>
-          <w:rFonts w:eastAsia="Times New Roman" w:cs="Times New Roman"/>
-          <w:noProof/>
-          <w:sz w:val="24"/>
-          <w:szCs w:val="24"/>
-          <w:lang w:eastAsia="en-US"/>
-        </w:rPr>
-        <w:t>= 0,</w:t>
-      </w:r>
-      <w:r>
-        <w:rPr>
-          <w:rFonts w:cs="Times New Roman"/>
-          <w:sz w:val="24"/>
-          <w:szCs w:val="24"/>
-        </w:rPr>
-        <w:t xml:space="preserve">404 </w:t>
-      </w:r>
-      <w:r>
-        <w:rPr>
-          <w:rFonts w:eastAsia="Times New Roman" w:cs="Times New Roman"/>
-          <w:noProof/>
-          <w:sz w:val="24"/>
-          <w:szCs w:val="24"/>
-          <w:lang w:eastAsia="en-US"/>
-        </w:rPr>
-        <w:t>(кг)</w:t>
-      </w:r>
-    </w:p>
-    <w:p>
-      <w:pPr>
-        <w:rPr>
-          <w:rFonts w:cs="Times New Roman"/>
-          <w:sz w:val="24"/>
-          <w:szCs w:val="24"/>
-        </w:rPr>
-      </w:pPr>
-    </w:p>
-    <w:p>
-      <w:pPr>
-        <w:rPr>
-          <w:rFonts w:cs="Times New Roman"/>
-          <w:noProof/>
-          <w:color w:val="000000"/>
-          <w:sz w:val="24"/>
-          <w:szCs w:val="24"/>
-        </w:rPr>
-      </w:pPr>
-      <w:r>
-        <w:rPr>
-          <w:rFonts w:cs="Times New Roman"/>
-          <w:i/>
-          <w:noProof/>
-          <w:color w:val="000000"/>
-          <w:sz w:val="24"/>
-          <w:szCs w:val="24"/>
-        </w:rPr>
-        <w:t>V</w:t>
-      </w:r>
-      <w:r>
-        <w:rPr>
-          <w:rFonts w:cs="Times New Roman"/>
-          <w:noProof/>
-          <w:color w:val="000000"/>
-          <w:sz w:val="24"/>
-          <w:szCs w:val="24"/>
-          <w:vertAlign w:val="subscript"/>
-        </w:rPr>
-        <w:t xml:space="preserve">2Т </w:t>
-      </w:r>
-      <w:r>
-        <w:rPr>
-          <w:rFonts w:cs="Times New Roman"/>
-          <w:noProof/>
-          <w:color w:val="000000"/>
-          <w:sz w:val="24"/>
-          <w:szCs w:val="24"/>
-        </w:rPr>
-        <w:t>–объем газа, вышедшего из трубопроводов после отключения подачи газа:</w:t>
-      </w:r>
-    </w:p>
-    <w:p>
-      <w:pPr>
-        <w:rPr>
-          <w:rFonts w:cs="Times New Roman"/>
-          <w:noProof/>
-          <w:color w:val="000000"/>
-          <w:sz w:val="24"/>
-          <w:szCs w:val="24"/>
-        </w:rPr>
-      </w:pPr>
-    </w:p>
-    <w:p>
-      <w:pPr>
-        <w:tabs>
-          <w:tab w:val="center" w:pos="4677"/>
-          <w:tab w:val="left" w:pos="7340"/>
-        </w:tabs>
-        <w:ind w:firstLine="709"/>
-        <w:contextualSpacing/>
-        <w:jc w:val="both"/>
-        <w:rPr>
-          <w:rFonts w:cs="Times New Roman"/>
-          <w:sz w:val="24"/>
-          <w:szCs w:val="24"/>
-        </w:rPr>
-      </w:pPr>
-      <w:r>
-        <w:rPr>
-          <w:rFonts w:cs="Times New Roman"/>
-          <w:sz w:val="24"/>
-          <w:szCs w:val="24"/>
-        </w:rPr>
-        <w:t>V2Т = 0,01·3,14·30·(0,0425²·47 + 0,0645²·71 + 0,0520²·9) = 0,381 м³</w:t>
-      </w:r>
-    </w:p>
-    <w:p>
-      <w:pPr>
-        <w:tabs>
-          <w:tab w:val="center" w:pos="4677"/>
-          <w:tab w:val="left" w:pos="7340"/>
-        </w:tabs>
-        <w:ind w:firstLine="709"/>
-        <w:contextualSpacing/>
-        <w:jc w:val="both"/>
-        <w:rPr>
-          <w:rFonts w:eastAsia="Times New Roman" w:cs="Times New Roman"/>
-          <w:noProof/>
-          <w:color w:val="000000"/>
-          <w:sz w:val="24"/>
-          <w:szCs w:val="24"/>
-          <w:lang w:eastAsia="en-US"/>
-        </w:rPr>
-      </w:pPr>
-      <w:r>
-        <w:rPr>
-          <w:rFonts w:eastAsia="Times New Roman" w:cs="Times New Roman"/>
-          <w:noProof/>
-          <w:color w:val="000000"/>
-          <w:sz w:val="24"/>
-          <w:szCs w:val="24"/>
-          <w:lang w:eastAsia="en-US"/>
-        </w:rPr>
-        <w:t>π = 3,14;</w:t>
-      </w:r>
-    </w:p>
-    <w:p>
-      <w:pPr>
-        <w:tabs>
-          <w:tab w:val="center" w:pos="4677"/>
-          <w:tab w:val="left" w:pos="7340"/>
-        </w:tabs>
-        <w:ind w:firstLine="709"/>
-        <w:contextualSpacing/>
-        <w:jc w:val="both"/>
-        <w:rPr>
-          <w:rFonts w:eastAsia="Times New Roman" w:cs="Times New Roman"/>
-          <w:noProof/>
-          <w:color w:val="000000"/>
-          <w:sz w:val="24"/>
-          <w:szCs w:val="24"/>
-          <w:lang w:eastAsia="en-US"/>
-        </w:rPr>
-      </w:pPr>
-      <w:r>
-        <w:rPr>
-          <w:rFonts w:eastAsia="Times New Roman" w:cs="Times New Roman"/>
-          <w:noProof/>
-          <w:color w:val="000000"/>
-          <w:sz w:val="24"/>
-          <w:szCs w:val="24"/>
-          <w:lang w:eastAsia="en-US"/>
-        </w:rPr>
-        <w:t>Р</w:t>
-      </w:r>
-      <w:r>
-        <w:rPr>
-          <w:rFonts w:eastAsia="Times New Roman" w:cs="Times New Roman"/>
-          <w:noProof/>
-          <w:color w:val="000000"/>
-          <w:sz w:val="24"/>
-          <w:szCs w:val="24"/>
-          <w:vertAlign w:val="subscript"/>
-          <w:lang w:eastAsia="en-US"/>
-        </w:rPr>
-        <w:t>2</w:t>
-      </w:r>
-      <w:r>
-        <w:rPr>
-          <w:rFonts w:eastAsia="Times New Roman" w:cs="Times New Roman"/>
-          <w:noProof/>
-          <w:color w:val="000000"/>
-          <w:sz w:val="24"/>
-          <w:szCs w:val="24"/>
-          <w:lang w:eastAsia="en-US"/>
-        </w:rPr>
-        <w:t xml:space="preserve"> – максимальное давление в трубопроводе по технологическому регламенту, равное </w:t>
-      </w:r>
-      <w:r>
-        <w:rPr>
-          <w:rFonts w:eastAsia="Times New Roman" w:cs="Times New Roman"/>
-          <w:noProof/>
-          <w:color w:val="000000"/>
-          <w:sz w:val="24"/>
-          <w:szCs w:val="24"/>
-        </w:rPr>
-        <w:t>3</w:t>
-      </w:r>
-      <w:r>
-        <w:rPr>
-          <w:rFonts w:eastAsia="Times New Roman" w:cs="Times New Roman"/>
-          <w:noProof/>
-          <w:color w:val="000000"/>
-          <w:sz w:val="24"/>
-          <w:szCs w:val="24"/>
-          <w:lang w:eastAsia="en-US"/>
-        </w:rPr>
-        <w:t>0 кПа;</w:t>
-      </w:r>
-    </w:p>
-    <w:p>
-      <w:pPr>
-        <w:tabs>
-          <w:tab w:val="center" w:pos="4677"/>
-          <w:tab w:val="left" w:pos="7340"/>
-        </w:tabs>
-        <w:ind w:firstLine="709"/>
-        <w:contextualSpacing/>
-        <w:jc w:val="both"/>
-        <w:rPr>
-          <w:rFonts w:eastAsia="Times New Roman" w:cs="Times New Roman"/>
-          <w:noProof/>
-          <w:color w:val="000000"/>
-          <w:sz w:val="24"/>
-          <w:szCs w:val="24"/>
-          <w:lang w:eastAsia="en-US"/>
-        </w:rPr>
-      </w:pPr>
-      <w:r>
-        <w:rPr>
-          <w:rFonts w:eastAsia="Times New Roman" w:cs="Times New Roman"/>
-          <w:noProof/>
-          <w:color w:val="000000"/>
-          <w:sz w:val="24"/>
-          <w:szCs w:val="24"/>
-          <w:lang w:eastAsia="en-US"/>
-        </w:rPr>
-        <w:t>r – внутренний радиус трубопроводов, м;</w:t>
-      </w:r>
-    </w:p>
-    <w:p>
-      <w:pPr>
-        <w:tabs>
-          <w:tab w:val="center" w:pos="4677"/>
-          <w:tab w:val="left" w:pos="7340"/>
-        </w:tabs>
-        <w:ind w:firstLine="709"/>
-        <w:contextualSpacing/>
-        <w:jc w:val="both"/>
-        <w:rPr>
-          <w:rFonts w:eastAsia="Times New Roman" w:cs="Times New Roman"/>
-          <w:noProof/>
-          <w:color w:val="000000"/>
-          <w:sz w:val="24"/>
-          <w:szCs w:val="24"/>
-          <w:lang w:eastAsia="en-US"/>
-        </w:rPr>
-      </w:pPr>
-      <w:r>
-        <w:rPr>
-          <w:rFonts w:eastAsia="Times New Roman" w:cs="Times New Roman"/>
-          <w:noProof/>
-          <w:color w:val="000000"/>
-          <w:sz w:val="24"/>
-          <w:szCs w:val="24"/>
-          <w:lang w:eastAsia="en-US"/>
-        </w:rPr>
-        <w:t>L – максимальная длина трубопроводов от аварийного участка до задвижек, м.</w:t>
-      </w:r>
-    </w:p>
-    <w:p>
-      <w:pPr>
-        <w:tabs>
-          <w:tab w:val="center" w:pos="4677"/>
-          <w:tab w:val="left" w:pos="7340"/>
-        </w:tabs>
-        <w:ind w:firstLine="709"/>
-        <w:contextualSpacing/>
-        <w:jc w:val="both"/>
-        <w:rPr>
-          <w:rFonts w:eastAsia="Times New Roman" w:cs="Times New Roman"/>
-          <w:noProof/>
-          <w:color w:val="000000"/>
-          <w:sz w:val="24"/>
-          <w:szCs w:val="24"/>
-          <w:lang w:eastAsia="en-US"/>
-        </w:rPr>
-      </w:pPr>
-    </w:p>
-    <w:p>
-      <w:pPr>
-        <w:rPr>
-          <w:rFonts w:cs="Times New Roman"/>
-          <w:sz w:val="24"/>
-          <w:szCs w:val="24"/>
-        </w:rPr>
-      </w:pPr>
-      <w:r>
-        <w:rPr>
-          <w:rFonts w:cs="Times New Roman"/>
-          <w:sz w:val="24"/>
-          <w:szCs w:val="24"/>
-        </w:rPr>
-        <w:t>Следовательно, масса газа, вышедшего из трубопровода после отключения подачи:</w:t>
-      </w:r>
-    </w:p>
-    <w:p>
-      <w:pPr>
-        <w:rPr>
-          <w:rFonts w:cs="Times New Roman"/>
-          <w:sz w:val="24"/>
-          <w:szCs w:val="24"/>
-        </w:rPr>
-      </w:pPr>
-    </w:p>
-    <w:p>
-      <w:pPr>
-        <w:rPr>
-          <w:rFonts w:cs="Times New Roman"/>
-          <w:sz w:val="24"/>
-          <w:szCs w:val="24"/>
-        </w:rPr>
-      </w:pPr>
-      <w:r>
-        <w:rPr>
-          <w:rFonts w:eastAsia="Times New Roman" w:cs="Times New Roman"/>
-          <w:i/>
-          <w:noProof/>
-          <w:color w:val="000000"/>
-          <w:sz w:val="24"/>
-          <w:szCs w:val="24"/>
-          <w:lang w:val="en-US" w:eastAsia="en-US"/>
-        </w:rPr>
-        <w:t>M</w:t>
-      </w:r>
-      <w:r>
-        <w:rPr>
-          <w:rFonts w:eastAsia="Times New Roman" w:cs="Times New Roman"/>
-          <w:noProof/>
-          <w:color w:val="000000"/>
-          <w:sz w:val="24"/>
-          <w:szCs w:val="24"/>
-          <w:vertAlign w:val="subscript"/>
-          <w:lang w:eastAsia="en-US"/>
-        </w:rPr>
-        <w:t>2Т</w:t>
-      </w:r>
-      <w:r>
-        <w:rPr>
-          <w:rFonts w:cs="Times New Roman"/>
-          <w:sz w:val="24"/>
-          <w:szCs w:val="24"/>
-        </w:rPr>
-        <w:t xml:space="preserve"> = 0,381 × 0,7 = 0,267 (кг).</w:t>
-      </w:r>
-    </w:p>
-    <w:p>
-      <w:pPr>
-        <w:rPr>
-          <w:rFonts w:cs="Times New Roman"/>
-          <w:sz w:val="24"/>
-          <w:szCs w:val="24"/>
-        </w:rPr>
-      </w:pPr>
-    </w:p>
-    <w:p>
-      <w:pPr>
-        <w:tabs>
-          <w:tab w:val="center" w:pos="4677"/>
-          <w:tab w:val="left" w:pos="7340"/>
-        </w:tabs>
-        <w:spacing w:line="360" w:lineRule="auto"/>
-        <w:jc w:val="both"/>
-        <w:rPr>
-          <w:rFonts w:eastAsia="Times New Roman" w:cs="Times New Roman"/>
-          <w:noProof/>
-          <w:color w:val="000000"/>
-          <w:sz w:val="24"/>
-          <w:szCs w:val="24"/>
-        </w:rPr>
-      </w:pPr>
-      <w:r>
-        <w:rPr>
-          <w:rFonts w:eastAsia="Times New Roman" w:cs="Times New Roman"/>
-          <w:noProof/>
-          <w:color w:val="000000"/>
-          <w:sz w:val="24"/>
-          <w:szCs w:val="24"/>
-          <w:lang w:eastAsia="en-US"/>
-        </w:rPr>
-        <w:t xml:space="preserve">Общая масса газа, вышедшего из трубопроводов: </w:t>
-      </w:r>
-    </w:p>
-    <w:p>
-      <w:pPr>
-        <w:tabs>
-          <w:tab w:val="center" w:pos="4677"/>
-          <w:tab w:val="left" w:pos="7340"/>
-        </w:tabs>
-        <w:spacing w:line="360" w:lineRule="auto"/>
-        <w:jc w:val="both"/>
-        <w:rPr>
-          <w:rFonts w:cs="Times New Roman"/>
-          <w:sz w:val="24"/>
-          <w:szCs w:val="24"/>
-        </w:rPr>
-      </w:pPr>
-      <w:r>
-        <w:rPr>
-          <w:rFonts w:eastAsia="Times New Roman" w:cs="Times New Roman"/>
-          <w:i/>
-          <w:noProof/>
-          <w:color w:val="000000"/>
-          <w:sz w:val="24"/>
-          <w:szCs w:val="24"/>
-          <w:lang w:val="en-US" w:eastAsia="en-US"/>
-        </w:rPr>
-        <w:t>M</w:t>
-      </w:r>
-      <w:r>
-        <w:rPr>
-          <w:rFonts w:eastAsia="Times New Roman" w:cs="Times New Roman"/>
-          <w:i/>
-          <w:noProof/>
-          <w:color w:val="000000"/>
-          <w:sz w:val="24"/>
-          <w:szCs w:val="24"/>
-          <w:vertAlign w:val="subscript"/>
-          <w:lang w:eastAsia="en-US"/>
-        </w:rPr>
-        <w:t>г</w:t>
-      </w:r>
-      <w:r>
-        <w:rPr>
-          <w:rFonts w:eastAsia="Times New Roman" w:cs="Times New Roman"/>
-          <w:i/>
-          <w:noProof/>
-          <w:color w:val="000000"/>
-          <w:sz w:val="24"/>
-          <w:szCs w:val="24"/>
-          <w:lang w:eastAsia="en-US"/>
-        </w:rPr>
-        <w:t xml:space="preserve"> = </w:t>
-      </w:r>
-      <w:r>
-        <w:rPr>
-          <w:rFonts w:eastAsia="Times New Roman" w:cs="Times New Roman"/>
-          <w:i/>
-          <w:noProof/>
-          <w:color w:val="000000"/>
-          <w:sz w:val="24"/>
-          <w:szCs w:val="24"/>
-          <w:lang w:val="en-US" w:eastAsia="en-US"/>
-        </w:rPr>
-        <w:t>M</w:t>
-      </w:r>
-      <w:r>
-        <w:rPr>
-          <w:rFonts w:eastAsia="Times New Roman" w:cs="Times New Roman"/>
-          <w:i/>
-          <w:noProof/>
-          <w:color w:val="000000"/>
-          <w:sz w:val="24"/>
-          <w:szCs w:val="24"/>
-          <w:vertAlign w:val="subscript"/>
-          <w:lang w:eastAsia="en-US"/>
-        </w:rPr>
-        <w:t>1Т</w:t>
-      </w:r>
-      <w:r>
-        <w:rPr>
-          <w:rFonts w:eastAsia="Times New Roman" w:cs="Times New Roman"/>
-          <w:i/>
-          <w:noProof/>
-          <w:color w:val="000000"/>
-          <w:sz w:val="24"/>
-          <w:szCs w:val="24"/>
-          <w:lang w:eastAsia="en-US"/>
-        </w:rPr>
-        <w:t xml:space="preserve"> + </w:t>
-      </w:r>
-      <w:r>
-        <w:rPr>
-          <w:rFonts w:eastAsia="Times New Roman" w:cs="Times New Roman"/>
-          <w:i/>
-          <w:noProof/>
-          <w:color w:val="000000"/>
-          <w:sz w:val="24"/>
-          <w:szCs w:val="24"/>
-          <w:lang w:val="en-US" w:eastAsia="en-US"/>
-        </w:rPr>
-        <w:t>M</w:t>
-      </w:r>
-      <w:r>
-        <w:rPr>
-          <w:rFonts w:eastAsia="Times New Roman" w:cs="Times New Roman"/>
-          <w:i/>
-          <w:noProof/>
-          <w:color w:val="000000"/>
-          <w:sz w:val="24"/>
-          <w:szCs w:val="24"/>
-          <w:vertAlign w:val="subscript"/>
-          <w:lang w:eastAsia="en-US"/>
-        </w:rPr>
-        <w:t>2Т</w:t>
-      </w:r>
-      <w:r>
-        <w:rPr>
-          <w:rFonts w:eastAsia="Times New Roman" w:cs="Times New Roman"/>
-          <w:noProof/>
-          <w:color w:val="000000"/>
-          <w:sz w:val="24"/>
-          <w:szCs w:val="24"/>
-          <w:lang w:eastAsia="en-US"/>
-        </w:rPr>
-        <w:t xml:space="preserve"> = </w:t>
-      </w:r>
-      <w:r>
-        <w:rPr>
-          <w:rFonts w:cs="Times New Roman"/>
-          <w:sz w:val="24"/>
-          <w:szCs w:val="24"/>
-        </w:rPr>
-        <w:t>0,</w:t>
-      </w:r>
-      <w:r>
-        <w:rPr>
-          <w:rFonts w:cs="Times New Roman"/>
-          <w:sz w:val="24"/>
-          <w:szCs w:val="24"/>
-        </w:rPr>
-        <w:t>404</w:t>
-      </w:r>
-      <w:r>
-        <w:rPr>
-          <w:rFonts w:cs="Times New Roman"/>
-          <w:sz w:val="24"/>
-          <w:szCs w:val="24"/>
-        </w:rPr>
-        <w:t xml:space="preserve"> + 0,267 = 0,672</w:t>
-      </w:r>
-      <w:r>
-        <w:rPr>
-          <w:rFonts w:eastAsia="Times New Roman" w:cs="Times New Roman"/>
-          <w:noProof/>
-          <w:color w:val="000000"/>
-          <w:sz w:val="24"/>
-          <w:szCs w:val="24"/>
-          <w:lang w:eastAsia="en-US"/>
-        </w:rPr>
-        <w:t xml:space="preserve"> (кг);</w:t>
-      </w:r>
-    </w:p>
-    <w:p>
-      <w:pPr>
-        <w:contextualSpacing/>
-        <w:rPr>
-          <w:rFonts w:cs="Times New Roman"/>
-          <w:sz w:val="24"/>
-          <w:szCs w:val="24"/>
-        </w:rPr>
-      </w:pPr>
-      <w:r>
-        <w:rPr>
-          <w:rFonts w:cs="Times New Roman"/>
-          <w:sz w:val="24"/>
-          <w:szCs w:val="24"/>
-        </w:rPr>
-        <w:t>Масса горючего вещества, содержащегося в облаке, с концентрацией между нижним и верхним концентрационным пределом распространения пламени составит:</w:t>
-      </w:r>
-    </w:p>
-    <w:p>
-      <w:pPr>
-        <w:contextualSpacing/>
-        <w:rPr>
-          <w:rFonts w:cs="Times New Roman"/>
-          <w:sz w:val="24"/>
-          <w:szCs w:val="24"/>
-        </w:rPr>
-      </w:pPr>
-    </w:p>
-    <w:p>
-      <w:pPr>
-        <w:contextualSpacing/>
-        <w:rPr>
-          <w:rFonts w:cs="Times New Roman"/>
-          <w:sz w:val="24"/>
-          <w:szCs w:val="24"/>
-        </w:rPr>
-      </w:pPr>
-      <w:r>
-        <w:rPr>
-          <w:rFonts w:cs="Times New Roman"/>
-          <w:sz w:val="24"/>
-          <w:szCs w:val="24"/>
-        </w:rPr>
-        <w:lastRenderedPageBreak/>
-        <w:t>m</w:t>
-      </w:r>
-      <w:r>
-        <w:rPr>
-          <w:rFonts w:cs="Times New Roman"/>
-          <w:sz w:val="24"/>
-          <w:szCs w:val="24"/>
-          <w:vertAlign w:val="subscript"/>
-        </w:rPr>
-        <w:t>г</w:t>
-      </w:r>
-      <w:r>
-        <w:rPr>
-          <w:rFonts w:cs="Times New Roman"/>
-          <w:sz w:val="24"/>
-          <w:szCs w:val="24"/>
-        </w:rPr>
-        <w:t xml:space="preserve"> = </w:t>
-      </w:r>
-      <w:r>
-        <w:rPr>
-          <w:rFonts w:eastAsia="Times New Roman" w:cs="Times New Roman"/>
-          <w:i/>
-          <w:noProof/>
-          <w:sz w:val="24"/>
-          <w:szCs w:val="24"/>
-          <w:lang w:val="en-US" w:eastAsia="en-US"/>
-        </w:rPr>
-        <w:t>M</w:t>
-      </w:r>
-      <w:r>
-        <w:rPr>
-          <w:rFonts w:eastAsia="Times New Roman" w:cs="Times New Roman"/>
-          <w:i/>
-          <w:noProof/>
-          <w:sz w:val="24"/>
-          <w:szCs w:val="24"/>
-          <w:vertAlign w:val="subscript"/>
-          <w:lang w:eastAsia="en-US"/>
-        </w:rPr>
-        <w:t>г</w:t>
-      </w:r>
-      <w:r>
-        <w:rPr>
-          <w:rFonts w:cs="Times New Roman"/>
-          <w:sz w:val="24"/>
-          <w:szCs w:val="24"/>
-        </w:rPr>
-        <w:t xml:space="preserve"> × Z = 0,672× 0,5 = 0,336 кг (для горючих газов Z = 0,5)</w:t>
-      </w:r>
-    </w:p>
-    <w:p>
-      <w:pPr>
-        <w:contextualSpacing/>
-        <w:rPr>
-          <w:rFonts w:cs="Times New Roman"/>
-          <w:sz w:val="24"/>
-          <w:szCs w:val="24"/>
-        </w:rPr>
-      </w:pPr>
-    </w:p>
-    <w:p>
-      <w:pPr>
-        <w:contextualSpacing/>
-        <w:rPr>
-          <w:rFonts w:cs="Times New Roman"/>
-          <w:sz w:val="24"/>
-          <w:szCs w:val="24"/>
-        </w:rPr>
-      </w:pPr>
-      <w:r>
-        <w:rPr>
-          <w:rFonts w:cs="Times New Roman"/>
-          <w:sz w:val="24"/>
-          <w:szCs w:val="24"/>
-        </w:rPr>
-        <w:t>Согласно СП 12.13130.2009 (ОПРЕДЕЛЕНИЕ КАТЕГОРИЙ ПОМЕЩЕНИЙ, ЗДАНИЙ И НАРУЖНЫХ УСТАНОВОК ПО ВЗРЫВОПОЖАРНОЙ И ПОЖАРНОЙ ОПАСНОСТИ) применяется следующий метод расчета:</w:t>
-      </w:r>
-    </w:p>
-    <w:p>
-      <w:pPr>
-        <w:contextualSpacing/>
-        <w:rPr>
-          <w:rFonts w:cs="Times New Roman"/>
-          <w:sz w:val="24"/>
-          <w:szCs w:val="24"/>
-        </w:rPr>
-      </w:pPr>
-      <w:r>
-        <w:rPr>
-          <w:rFonts w:cs="Times New Roman"/>
-          <w:sz w:val="24"/>
-          <w:szCs w:val="24"/>
-        </w:rPr>
-        <w:t>Избыточное давление ΔР для индивидуальных горючих веществ, состоящих из атомов С, Н, О, N, Сl, Вr, I, F, определяется по формуле</w:t>
-      </w:r>
-    </w:p>
-    <w:p>
-      <w:pPr>
-        <w:contextualSpacing/>
-        <w:rPr>
-          <w:rFonts w:cs="Times New Roman"/>
-          <w:sz w:val="24"/>
-          <w:szCs w:val="24"/>
-        </w:rPr>
-      </w:pPr>
-    </w:p>
-    <w:p>
-      <w:pPr>
-        <w:rPr>
-          <w:rFonts w:eastAsia="Times New Roman" w:cs="Times New Roman"/>
-          <w:sz w:val="24"/>
-          <w:szCs w:val="24"/>
-          <w:lang w:eastAsia="ru-RU"/>
-        </w:rPr>
-      </w:pPr>
-      <w:r>
-        <w:rPr>
-          <w:rFonts w:eastAsia="Times New Roman" w:cs="Times New Roman"/>
-          <w:sz w:val="24"/>
-          <w:szCs w:val="24"/>
-          <w:lang w:eastAsia="ru-RU"/>
-        </w:rPr>
-        <w:t>∆Р = (Р</w:t>
-      </w:r>
-      <w:r>
-        <w:rPr>
-          <w:rFonts w:eastAsia="Times New Roman" w:cs="Times New Roman"/>
-          <w:sz w:val="24"/>
-          <w:szCs w:val="24"/>
-          <w:vertAlign w:val="subscript"/>
-          <w:lang w:eastAsia="ru-RU"/>
-        </w:rPr>
-        <w:t>max</w:t>
-      </w:r>
-      <w:r>
-        <w:rPr>
-          <w:rFonts w:eastAsia="Times New Roman" w:cs="Times New Roman"/>
-          <w:sz w:val="24"/>
-          <w:szCs w:val="24"/>
-          <w:lang w:eastAsia="ru-RU"/>
-        </w:rPr>
-        <w:t xml:space="preserve"> – Р</w:t>
-      </w:r>
-      <w:r>
-        <w:rPr>
-          <w:rFonts w:eastAsia="Times New Roman" w:cs="Times New Roman"/>
-          <w:sz w:val="24"/>
-          <w:szCs w:val="24"/>
-          <w:vertAlign w:val="subscript"/>
-          <w:lang w:eastAsia="ru-RU"/>
-        </w:rPr>
-        <w:t>0</w:t>
-      </w:r>
-      <w:r>
-        <w:rPr>
-          <w:rFonts w:eastAsia="Times New Roman" w:cs="Times New Roman"/>
-          <w:sz w:val="24"/>
-          <w:szCs w:val="24"/>
-          <w:lang w:eastAsia="ru-RU"/>
-        </w:rPr>
-        <w:t>) ∙ ((m</w:t>
-      </w:r>
-      <w:r>
-        <w:rPr>
-          <w:rFonts w:cs="Times New Roman"/>
-          <w:sz w:val="24"/>
-          <w:szCs w:val="24"/>
-        </w:rPr>
-        <w:t>×</w:t>
-      </w:r>
-      <w:r>
-        <w:rPr>
-          <w:rFonts w:eastAsia="Times New Roman" w:cs="Times New Roman"/>
-          <w:sz w:val="24"/>
-          <w:szCs w:val="24"/>
-          <w:lang w:eastAsia="ru-RU"/>
-        </w:rPr>
-        <w:t>Z)/(V</w:t>
-      </w:r>
-      <w:r>
-        <w:rPr>
-          <w:rFonts w:eastAsia="Times New Roman" w:cs="Times New Roman"/>
-          <w:sz w:val="24"/>
-          <w:szCs w:val="24"/>
-          <w:vertAlign w:val="subscript"/>
-          <w:lang w:eastAsia="ru-RU"/>
-        </w:rPr>
-        <w:t>св</w:t>
-      </w:r>
-      <w:r>
-        <w:rPr>
-          <w:rFonts w:cs="Times New Roman"/>
-          <w:sz w:val="24"/>
-          <w:szCs w:val="24"/>
-        </w:rPr>
-        <w:t>×</w:t>
-      </w:r>
-      <w:r>
-        <w:rPr>
-          <w:rFonts w:eastAsia="Times New Roman" w:cs="Times New Roman"/>
-          <w:sz w:val="24"/>
-          <w:szCs w:val="24"/>
-          <w:lang w:eastAsia="ru-RU"/>
-        </w:rPr>
-        <w:t>ρ</w:t>
-      </w:r>
-      <w:r>
-        <w:rPr>
-          <w:rFonts w:eastAsia="Times New Roman" w:cs="Times New Roman"/>
-          <w:sz w:val="24"/>
-          <w:szCs w:val="24"/>
-          <w:vertAlign w:val="subscript"/>
-          <w:lang w:eastAsia="ru-RU"/>
-        </w:rPr>
-        <w:t>г.п.</w:t>
-      </w:r>
-      <w:r>
-        <w:rPr>
-          <w:rFonts w:eastAsia="Times New Roman" w:cs="Times New Roman"/>
-          <w:sz w:val="24"/>
-          <w:szCs w:val="24"/>
-          <w:lang w:eastAsia="ru-RU"/>
-        </w:rPr>
-        <w:t>)) ∙ (100/С</w:t>
-      </w:r>
-      <w:r>
-        <w:rPr>
-          <w:rFonts w:eastAsia="Times New Roman" w:cs="Times New Roman"/>
-          <w:sz w:val="24"/>
-          <w:szCs w:val="24"/>
-          <w:vertAlign w:val="subscript"/>
-          <w:lang w:eastAsia="ru-RU"/>
-        </w:rPr>
-        <w:t>ст</w:t>
-      </w:r>
-      <w:r>
-        <w:rPr>
-          <w:rFonts w:eastAsia="Times New Roman" w:cs="Times New Roman"/>
-          <w:sz w:val="24"/>
-          <w:szCs w:val="24"/>
-          <w:lang w:eastAsia="ru-RU"/>
-        </w:rPr>
-        <w:t>) ∙ (1/К</w:t>
-      </w:r>
-      <w:r>
-        <w:rPr>
-          <w:rFonts w:eastAsia="Times New Roman" w:cs="Times New Roman"/>
-          <w:sz w:val="24"/>
-          <w:szCs w:val="24"/>
-          <w:vertAlign w:val="subscript"/>
-          <w:lang w:eastAsia="ru-RU"/>
-        </w:rPr>
-        <w:t>н</w:t>
-      </w:r>
-      <w:r>
-        <w:rPr>
-          <w:rFonts w:eastAsia="Times New Roman" w:cs="Times New Roman"/>
-          <w:sz w:val="24"/>
-          <w:szCs w:val="24"/>
-          <w:lang w:eastAsia="ru-RU"/>
-        </w:rPr>
-        <w:t>), где</w:t>
-      </w:r>
-    </w:p>
-    <w:p>
-      <w:pPr>
-        <w:rPr>
-          <w:rFonts w:eastAsia="Times New Roman" w:cs="Times New Roman"/>
-          <w:sz w:val="24"/>
-          <w:szCs w:val="24"/>
-          <w:lang w:eastAsia="ru-RU"/>
-        </w:rPr>
-      </w:pPr>
-    </w:p>
-    <w:p>
-      <w:pPr>
-        <w:rPr>
-          <w:rFonts w:eastAsia="Times New Roman" w:cs="Times New Roman"/>
-          <w:sz w:val="24"/>
-          <w:szCs w:val="24"/>
-          <w:lang w:eastAsia="ru-RU"/>
-        </w:rPr>
-      </w:pPr>
-      <w:r>
-        <w:rPr>
-          <w:rFonts w:eastAsia="Times New Roman" w:cs="Times New Roman"/>
-          <w:sz w:val="24"/>
-          <w:szCs w:val="24"/>
-          <w:lang w:eastAsia="ru-RU"/>
-        </w:rPr>
-        <w:t>Р</w:t>
-      </w:r>
-      <w:r>
-        <w:rPr>
-          <w:rFonts w:eastAsia="Times New Roman" w:cs="Times New Roman"/>
-          <w:sz w:val="24"/>
-          <w:szCs w:val="24"/>
-          <w:vertAlign w:val="subscript"/>
-          <w:lang w:eastAsia="ru-RU"/>
-        </w:rPr>
-        <w:t>max</w:t>
-      </w:r>
-      <w:r>
-        <w:rPr>
-          <w:rFonts w:eastAsia="Times New Roman" w:cs="Times New Roman"/>
-          <w:sz w:val="24"/>
-          <w:szCs w:val="24"/>
-          <w:lang w:eastAsia="ru-RU"/>
-        </w:rPr>
-        <w:t xml:space="preserve"> – максимальное давление взрыва стехиометрической газовоздушной смеси в замкнутом объеме</w:t>
-      </w:r>
-      <w:r>
-        <w:rPr>
-          <w:rFonts w:cs="Times New Roman"/>
-          <w:sz w:val="24"/>
-          <w:szCs w:val="24"/>
-        </w:rPr>
-        <w:t xml:space="preserve"> (</w:t>
-      </w:r>
-      <w:r>
-        <w:rPr>
-          <w:rFonts w:eastAsia="Times New Roman" w:cs="Times New Roman"/>
-          <w:sz w:val="24"/>
-          <w:szCs w:val="24"/>
-          <w:lang w:eastAsia="ru-RU"/>
-        </w:rPr>
-        <w:t>допускается принимать 900 кПа),</w:t>
-      </w:r>
-    </w:p>
-    <w:p>
-      <w:pPr>
-        <w:rPr>
-          <w:rFonts w:eastAsia="Times New Roman" w:cs="Times New Roman"/>
-          <w:sz w:val="24"/>
-          <w:szCs w:val="24"/>
-          <w:lang w:eastAsia="ru-RU"/>
-        </w:rPr>
-      </w:pPr>
-      <w:r>
-        <w:rPr>
-          <w:rFonts w:eastAsia="Times New Roman" w:cs="Times New Roman"/>
-          <w:sz w:val="24"/>
-          <w:szCs w:val="24"/>
-          <w:lang w:eastAsia="ru-RU"/>
-        </w:rPr>
-        <w:t>Р</w:t>
-      </w:r>
-      <w:r>
-        <w:rPr>
-          <w:rFonts w:eastAsia="Times New Roman" w:cs="Times New Roman"/>
-          <w:sz w:val="24"/>
-          <w:szCs w:val="24"/>
-          <w:vertAlign w:val="subscript"/>
-          <w:lang w:eastAsia="ru-RU"/>
-        </w:rPr>
-        <w:t xml:space="preserve">0 </w:t>
-      </w:r>
-      <w:r>
-        <w:rPr>
-          <w:rFonts w:eastAsia="Times New Roman" w:cs="Times New Roman"/>
-          <w:sz w:val="24"/>
-          <w:szCs w:val="24"/>
-          <w:lang w:eastAsia="ru-RU"/>
-        </w:rPr>
-        <w:t>– начальное давление, кПа (допускается принимать равным 101кПа),</w:t>
-      </w:r>
-    </w:p>
-    <w:p>
-      <w:pPr>
-        <w:rPr>
-          <w:rFonts w:eastAsia="Times New Roman" w:cs="Times New Roman"/>
-          <w:sz w:val="24"/>
-          <w:szCs w:val="24"/>
-          <w:lang w:eastAsia="ru-RU"/>
-        </w:rPr>
-      </w:pPr>
-      <w:r>
-        <w:rPr>
-          <w:rFonts w:eastAsia="Times New Roman" w:cs="Times New Roman"/>
-          <w:sz w:val="24"/>
-          <w:szCs w:val="24"/>
-          <w:lang w:eastAsia="ru-RU"/>
-        </w:rPr>
-        <w:t>m – масса ГГ, вышедших в результате аварии в помещение,</w:t>
-      </w:r>
-    </w:p>
-    <w:p>
-      <w:pPr>
-        <w:rPr>
-          <w:rFonts w:eastAsia="Times New Roman" w:cs="Times New Roman"/>
-          <w:sz w:val="24"/>
-          <w:szCs w:val="24"/>
-          <w:lang w:eastAsia="ru-RU"/>
-        </w:rPr>
-      </w:pPr>
-      <w:r>
-        <w:rPr>
-          <w:rFonts w:eastAsia="Times New Roman" w:cs="Times New Roman"/>
-          <w:sz w:val="24"/>
-          <w:szCs w:val="24"/>
-          <w:lang w:eastAsia="ru-RU"/>
-        </w:rPr>
-        <w:t>К</w:t>
-      </w:r>
-      <w:r>
-        <w:rPr>
-          <w:rFonts w:eastAsia="Times New Roman" w:cs="Times New Roman"/>
-          <w:sz w:val="24"/>
-          <w:szCs w:val="24"/>
-          <w:vertAlign w:val="subscript"/>
-          <w:lang w:eastAsia="ru-RU"/>
-        </w:rPr>
-        <w:t>н</w:t>
-      </w:r>
-      <w:r>
-        <w:rPr>
-          <w:rFonts w:eastAsia="Times New Roman" w:cs="Times New Roman"/>
-          <w:sz w:val="24"/>
-          <w:szCs w:val="24"/>
-          <w:lang w:eastAsia="ru-RU"/>
-        </w:rPr>
-        <w:t xml:space="preserve"> – коэффициент, учитывающий негерметичность помещения и неадиабатичность процесса горения (допускается принимать равным 3),</w:t>
-      </w:r>
-    </w:p>
-    <w:p>
-      <w:pPr>
-        <w:contextualSpacing/>
-        <w:rPr>
-          <w:rFonts w:cs="Times New Roman"/>
-          <w:sz w:val="24"/>
-          <w:szCs w:val="24"/>
-        </w:rPr>
-      </w:pPr>
-      <w:r>
-        <w:rPr>
-          <w:rFonts w:eastAsia="Times New Roman" w:cs="Times New Roman"/>
-          <w:sz w:val="24"/>
-          <w:szCs w:val="24"/>
-          <w:lang w:eastAsia="ru-RU"/>
-        </w:rPr>
-        <w:t>V</w:t>
-      </w:r>
-      <w:r>
-        <w:rPr>
-          <w:rFonts w:eastAsia="Times New Roman" w:cs="Times New Roman"/>
-          <w:sz w:val="24"/>
-          <w:szCs w:val="24"/>
-          <w:vertAlign w:val="subscript"/>
-          <w:lang w:eastAsia="ru-RU"/>
-        </w:rPr>
-        <w:t>св</w:t>
-      </w:r>
-      <w:r>
-        <w:rPr>
-          <w:rFonts w:eastAsia="Times New Roman" w:cs="Times New Roman"/>
-          <w:sz w:val="24"/>
-          <w:szCs w:val="24"/>
-          <w:lang w:eastAsia="ru-RU"/>
-        </w:rPr>
-        <w:t xml:space="preserve"> - свободный объем помещения,</w:t>
-      </w:r>
-    </w:p>
-    <w:p>
-      <w:pPr>
-        <w:contextualSpacing/>
-        <w:rPr>
-          <w:rFonts w:cs="Times New Roman"/>
-          <w:sz w:val="24"/>
-          <w:szCs w:val="24"/>
-        </w:rPr>
-      </w:pPr>
-      <w:r>
-        <w:rPr>
-          <w:rFonts w:eastAsia="Times New Roman" w:cs="Times New Roman"/>
-          <w:sz w:val="24"/>
-          <w:szCs w:val="24"/>
-          <w:lang w:eastAsia="ru-RU"/>
-        </w:rPr>
-        <w:t>Z</w:t>
-      </w:r>
-      <w:r>
-        <w:rPr>
-          <w:rFonts w:cs="Times New Roman"/>
-          <w:sz w:val="24"/>
-          <w:szCs w:val="24"/>
-        </w:rPr>
-        <w:t xml:space="preserve"> - коэффициент участия горючих газов и паров в горении.</w:t>
-      </w:r>
-    </w:p>
-    <w:p>
-      <w:pPr>
-        <w:contextualSpacing/>
-        <w:rPr>
-          <w:rFonts w:cs="Times New Roman"/>
-          <w:sz w:val="24"/>
-          <w:szCs w:val="24"/>
-        </w:rPr>
-      </w:pPr>
-      <w:r>
-        <w:rPr>
-          <w:rFonts w:eastAsia="Times New Roman" w:cs="Times New Roman"/>
-          <w:sz w:val="24"/>
-          <w:szCs w:val="24"/>
-          <w:lang w:eastAsia="ru-RU"/>
-        </w:rPr>
-        <w:t>ρ</w:t>
-      </w:r>
-      <w:r>
-        <w:rPr>
-          <w:rFonts w:eastAsia="Times New Roman" w:cs="Times New Roman"/>
-          <w:sz w:val="24"/>
-          <w:szCs w:val="24"/>
-          <w:vertAlign w:val="subscript"/>
-          <w:lang w:eastAsia="ru-RU"/>
-        </w:rPr>
-        <w:t>г.п.</w:t>
-      </w:r>
-      <w:r>
-        <w:rPr>
-          <w:rFonts w:eastAsia="Times New Roman" w:cs="Times New Roman"/>
-          <w:sz w:val="24"/>
-          <w:szCs w:val="24"/>
-          <w:lang w:eastAsia="ru-RU"/>
-        </w:rPr>
-        <w:t xml:space="preserve"> - </w:t>
-      </w:r>
-      <w:r>
-        <w:rPr>
-          <w:rFonts w:cs="Times New Roman"/>
-          <w:sz w:val="24"/>
-          <w:szCs w:val="24"/>
-        </w:rPr>
-        <w:t>плотность газа или пара при расчетной температуре, вычисляемая по формуле:</w:t>
-      </w:r>
-    </w:p>
-    <w:p>
-      <w:pPr>
-        <w:contextualSpacing/>
-        <w:rPr>
-          <w:rFonts w:cs="Times New Roman"/>
-          <w:sz w:val="24"/>
-          <w:szCs w:val="24"/>
-        </w:rPr>
-      </w:pPr>
-    </w:p>
-    <w:p>
-      <w:pPr>
-        <w:rPr>
-          <w:rFonts w:eastAsia="Times New Roman" w:cs="Times New Roman"/>
-          <w:sz w:val="24"/>
-          <w:szCs w:val="24"/>
-          <w:lang w:eastAsia="ru-RU"/>
-        </w:rPr>
-      </w:pPr>
-      <w:r>
-        <w:rPr>
-          <w:rFonts w:eastAsia="Times New Roman" w:cs="Times New Roman"/>
-          <w:sz w:val="24"/>
-          <w:szCs w:val="24"/>
-          <w:lang w:eastAsia="ru-RU"/>
-        </w:rPr>
-        <w:t>ρ</w:t>
-      </w:r>
-      <w:r>
-        <w:rPr>
-          <w:rFonts w:eastAsia="Times New Roman" w:cs="Times New Roman"/>
-          <w:sz w:val="24"/>
-          <w:szCs w:val="24"/>
-          <w:vertAlign w:val="subscript"/>
-          <w:lang w:eastAsia="ru-RU"/>
-        </w:rPr>
-        <w:t>г.п.</w:t>
-      </w:r>
-      <w:r>
-        <w:rPr>
-          <w:rFonts w:eastAsia="Times New Roman" w:cs="Times New Roman"/>
-          <w:sz w:val="24"/>
-          <w:szCs w:val="24"/>
-          <w:lang w:eastAsia="ru-RU"/>
-        </w:rPr>
-        <w:t>= M / V</w:t>
-      </w:r>
-      <w:r>
-        <w:rPr>
-          <w:rFonts w:eastAsia="Times New Roman" w:cs="Times New Roman"/>
-          <w:sz w:val="24"/>
-          <w:szCs w:val="24"/>
-          <w:vertAlign w:val="subscript"/>
-          <w:lang w:eastAsia="ru-RU"/>
-        </w:rPr>
-        <w:t xml:space="preserve">0 </w:t>
-      </w:r>
-      <w:r>
-        <w:rPr>
-          <w:rFonts w:eastAsia="Times New Roman" w:cs="Times New Roman"/>
-          <w:sz w:val="24"/>
-          <w:szCs w:val="24"/>
-          <w:lang w:eastAsia="ru-RU"/>
-        </w:rPr>
-        <w:t>· (1+0,00366·t</w:t>
-      </w:r>
-      <w:r>
-        <w:rPr>
-          <w:rFonts w:eastAsia="Times New Roman" w:cs="Times New Roman"/>
-          <w:sz w:val="24"/>
-          <w:szCs w:val="24"/>
-          <w:vertAlign w:val="subscript"/>
-          <w:lang w:eastAsia="ru-RU"/>
-        </w:rPr>
-        <w:t>р</w:t>
-      </w:r>
-      <w:r>
-        <w:rPr>
-          <w:rFonts w:eastAsia="Times New Roman" w:cs="Times New Roman"/>
-          <w:sz w:val="24"/>
-          <w:szCs w:val="24"/>
-          <w:lang w:eastAsia="ru-RU"/>
-        </w:rPr>
-        <w:t xml:space="preserve">) = </w:t>
-      </w:r>
-      <w:r>
-        <w:rPr>
-          <w:rFonts w:cs="Times New Roman"/>
-          <w:sz w:val="24"/>
-          <w:szCs w:val="24"/>
-        </w:rPr>
-        <w:t xml:space="preserve">1,833 </w:t>
-      </w:r>
-      <w:r>
-        <w:rPr>
-          <w:rFonts w:eastAsia="Times New Roman" w:cs="Times New Roman"/>
-          <w:sz w:val="24"/>
-          <w:szCs w:val="24"/>
-          <w:lang w:eastAsia="ru-RU"/>
-        </w:rPr>
-        <w:t>кг/м</w:t>
-      </w:r>
-      <w:r>
-        <w:rPr>
-          <w:rFonts w:eastAsia="Times New Roman" w:cs="Times New Roman"/>
-          <w:sz w:val="24"/>
-          <w:szCs w:val="24"/>
-          <w:vertAlign w:val="superscript"/>
-          <w:lang w:eastAsia="ru-RU"/>
-        </w:rPr>
-        <w:t>3</w:t>
-      </w:r>
-    </w:p>
-    <w:p>
-      <w:pPr>
-        <w:contextualSpacing/>
-        <w:rPr>
-          <w:rFonts w:cs="Times New Roman"/>
-          <w:sz w:val="24"/>
-          <w:szCs w:val="24"/>
-        </w:rPr>
-      </w:pPr>
-    </w:p>
-    <w:p>
-      <w:pPr>
-        <w:rPr>
-          <w:rFonts w:eastAsia="Times New Roman" w:cs="Times New Roman"/>
-          <w:sz w:val="24"/>
-          <w:szCs w:val="24"/>
-          <w:lang w:eastAsia="ru-RU"/>
-        </w:rPr>
-      </w:pPr>
-      <w:r>
-        <w:rPr>
-          <w:rFonts w:eastAsia="Times New Roman" w:cs="Times New Roman"/>
-          <w:sz w:val="24"/>
-          <w:szCs w:val="24"/>
-          <w:lang w:eastAsia="ru-RU"/>
-        </w:rPr>
-        <w:t>М - молярная масса, равный 44,096 кг/кмоль</w:t>
-      </w:r>
-    </w:p>
-    <w:p>
-      <w:pPr>
-        <w:rPr>
-          <w:rFonts w:eastAsia="Times New Roman" w:cs="Times New Roman"/>
-          <w:sz w:val="24"/>
-          <w:szCs w:val="24"/>
-          <w:lang w:eastAsia="ru-RU"/>
-        </w:rPr>
-      </w:pPr>
-      <w:r>
-        <w:rPr>
-          <w:rFonts w:eastAsia="Times New Roman" w:cs="Times New Roman"/>
-          <w:sz w:val="24"/>
-          <w:szCs w:val="24"/>
-          <w:lang w:eastAsia="ru-RU"/>
-        </w:rPr>
-        <w:t>V</w:t>
-      </w:r>
-      <w:r>
-        <w:rPr>
-          <w:rFonts w:eastAsia="Times New Roman" w:cs="Times New Roman"/>
-          <w:sz w:val="24"/>
-          <w:szCs w:val="24"/>
-          <w:vertAlign w:val="subscript"/>
-          <w:lang w:eastAsia="ru-RU"/>
-        </w:rPr>
-        <w:t>0</w:t>
-      </w:r>
-      <w:r>
-        <w:rPr>
-          <w:rFonts w:eastAsia="Times New Roman" w:cs="Times New Roman"/>
-          <w:sz w:val="24"/>
-          <w:szCs w:val="24"/>
-          <w:lang w:eastAsia="ru-RU"/>
-        </w:rPr>
-        <w:t xml:space="preserve"> - мольный объем, равный 22,413</w:t>
-      </w:r>
-    </w:p>
-    <w:p>
-      <w:pPr>
-        <w:rPr>
-          <w:rFonts w:eastAsia="Times New Roman" w:cs="Times New Roman"/>
-          <w:sz w:val="24"/>
-          <w:szCs w:val="24"/>
-          <w:lang w:eastAsia="ru-RU"/>
-        </w:rPr>
-      </w:pPr>
-      <w:r>
-        <w:rPr>
-          <w:rFonts w:eastAsia="Times New Roman" w:cs="Times New Roman"/>
-          <w:sz w:val="24"/>
-          <w:szCs w:val="24"/>
-          <w:lang w:eastAsia="ru-RU"/>
-        </w:rPr>
-        <w:t>t</w:t>
-      </w:r>
-      <w:r>
-        <w:rPr>
-          <w:rFonts w:eastAsia="Times New Roman" w:cs="Times New Roman"/>
-          <w:sz w:val="24"/>
-          <w:szCs w:val="24"/>
-          <w:vertAlign w:val="subscript"/>
-          <w:lang w:eastAsia="ru-RU"/>
-        </w:rPr>
-        <w:t>р</w:t>
-      </w:r>
-      <w:r>
-        <w:rPr>
-          <w:rFonts w:eastAsia="Times New Roman" w:cs="Times New Roman"/>
-          <w:sz w:val="24"/>
-          <w:szCs w:val="24"/>
-          <w:lang w:eastAsia="ru-RU"/>
-        </w:rPr>
-        <w:t xml:space="preserve"> - расчетная температура (принимается равная 20</w:t>
-      </w:r>
-      <w:r>
-        <w:rPr>
-          <w:rFonts w:eastAsia="Times New Roman" w:cs="Times New Roman"/>
-          <w:sz w:val="24"/>
-          <w:szCs w:val="24"/>
-          <w:vertAlign w:val="superscript"/>
-          <w:lang w:eastAsia="ru-RU"/>
-        </w:rPr>
-        <w:t>0</w:t>
-      </w:r>
-      <w:r>
-        <w:rPr>
-          <w:rFonts w:eastAsia="Times New Roman" w:cs="Times New Roman"/>
-          <w:sz w:val="24"/>
-          <w:szCs w:val="24"/>
-          <w:lang w:eastAsia="ru-RU"/>
-        </w:rPr>
-        <w:t>С)</w:t>
-      </w:r>
-    </w:p>
-    <w:p>
-      <w:pPr>
-        <w:contextualSpacing/>
-        <w:rPr>
-          <w:rFonts w:cs="Times New Roman"/>
-          <w:sz w:val="24"/>
-          <w:szCs w:val="24"/>
-        </w:rPr>
-      </w:pPr>
-    </w:p>
-    <w:p>
-      <w:pPr>
-        <w:contextualSpacing/>
-        <w:rPr>
-          <w:rFonts w:eastAsia="Times New Roman" w:cs="Times New Roman"/>
-          <w:color w:val="000000"/>
-          <w:sz w:val="24"/>
-          <w:szCs w:val="24"/>
-          <w:lang w:eastAsia="ru-RU"/>
-        </w:rPr>
-      </w:pPr>
-      <w:r>
-        <w:rPr>
-          <w:rFonts w:eastAsia="Times New Roman" w:cs="Times New Roman"/>
-          <w:color w:val="000000"/>
-          <w:sz w:val="24"/>
-          <w:szCs w:val="24"/>
-          <w:lang w:eastAsia="ru-RU"/>
-        </w:rPr>
-        <w:t>∆Р = (Р</w:t>
-      </w:r>
-      <w:r>
-        <w:rPr>
-          <w:rFonts w:eastAsia="Times New Roman" w:cs="Times New Roman"/>
-          <w:color w:val="000000"/>
-          <w:sz w:val="24"/>
-          <w:szCs w:val="24"/>
-          <w:vertAlign w:val="subscript"/>
-          <w:lang w:eastAsia="ru-RU"/>
-        </w:rPr>
-        <w:t>max</w:t>
-      </w:r>
-      <w:r>
-        <w:rPr>
-          <w:rFonts w:eastAsia="Times New Roman" w:cs="Times New Roman"/>
-          <w:color w:val="000000"/>
-          <w:sz w:val="24"/>
-          <w:szCs w:val="24"/>
-          <w:lang w:eastAsia="ru-RU"/>
-        </w:rPr>
-        <w:t xml:space="preserve"> – Р</w:t>
-      </w:r>
-      <w:r>
-        <w:rPr>
-          <w:rFonts w:eastAsia="Times New Roman" w:cs="Times New Roman"/>
-          <w:color w:val="000000"/>
-          <w:sz w:val="24"/>
-          <w:szCs w:val="24"/>
-          <w:vertAlign w:val="subscript"/>
-          <w:lang w:eastAsia="ru-RU"/>
-        </w:rPr>
-        <w:t>0</w:t>
-      </w:r>
-      <w:r>
-        <w:rPr>
-          <w:rFonts w:eastAsia="Times New Roman" w:cs="Times New Roman"/>
-          <w:color w:val="000000"/>
-          <w:sz w:val="24"/>
-          <w:szCs w:val="24"/>
-          <w:lang w:eastAsia="ru-RU"/>
-        </w:rPr>
-        <w:t>) ∙ ((m</w:t>
-      </w:r>
-      <w:r>
-        <w:rPr>
-          <w:rFonts w:cs="Times New Roman"/>
-          <w:sz w:val="24"/>
-          <w:szCs w:val="24"/>
-        </w:rPr>
-        <w:t>×</w:t>
-      </w:r>
-      <w:r>
-        <w:rPr>
-          <w:rFonts w:eastAsia="Times New Roman" w:cs="Times New Roman"/>
-          <w:color w:val="000000"/>
-          <w:sz w:val="24"/>
-          <w:szCs w:val="24"/>
-          <w:lang w:eastAsia="ru-RU"/>
-        </w:rPr>
-        <w:t>Z)/(V</w:t>
-      </w:r>
-      <w:r>
-        <w:rPr>
-          <w:rFonts w:eastAsia="Times New Roman" w:cs="Times New Roman"/>
-          <w:color w:val="000000"/>
-          <w:sz w:val="24"/>
-          <w:szCs w:val="24"/>
-          <w:vertAlign w:val="subscript"/>
-          <w:lang w:eastAsia="ru-RU"/>
-        </w:rPr>
-        <w:t>св</w:t>
-      </w:r>
-      <w:r>
-        <w:rPr>
-          <w:rFonts w:cs="Times New Roman"/>
-          <w:sz w:val="24"/>
-          <w:szCs w:val="24"/>
-        </w:rPr>
-        <w:t>×</w:t>
-      </w:r>
-      <w:r>
-        <w:rPr>
-          <w:rFonts w:eastAsia="Times New Roman" w:cs="Times New Roman"/>
-          <w:color w:val="000000"/>
-          <w:sz w:val="24"/>
-          <w:szCs w:val="24"/>
-          <w:lang w:eastAsia="ru-RU"/>
-        </w:rPr>
-        <w:t>ρ</w:t>
-      </w:r>
-      <w:r>
-        <w:rPr>
-          <w:rFonts w:eastAsia="Times New Roman" w:cs="Times New Roman"/>
-          <w:color w:val="000000"/>
-          <w:sz w:val="24"/>
-          <w:szCs w:val="24"/>
-          <w:vertAlign w:val="subscript"/>
-          <w:lang w:eastAsia="ru-RU"/>
-        </w:rPr>
-        <w:t>г.п.</w:t>
-      </w:r>
-      <w:r>
-        <w:rPr>
-          <w:rFonts w:eastAsia="Times New Roman" w:cs="Times New Roman"/>
-          <w:color w:val="000000"/>
-          <w:sz w:val="24"/>
-          <w:szCs w:val="24"/>
-          <w:lang w:eastAsia="ru-RU"/>
-        </w:rPr>
-        <w:t>)) ∙ (100/С</w:t>
-      </w:r>
-      <w:r>
-        <w:rPr>
-          <w:rFonts w:eastAsia="Times New Roman" w:cs="Times New Roman"/>
-          <w:color w:val="000000"/>
-          <w:sz w:val="24"/>
-          <w:szCs w:val="24"/>
-          <w:vertAlign w:val="subscript"/>
-          <w:lang w:eastAsia="ru-RU"/>
-        </w:rPr>
-        <w:t>ст</w:t>
-      </w:r>
-      <w:r>
-        <w:rPr>
-          <w:rFonts w:eastAsia="Times New Roman" w:cs="Times New Roman"/>
-          <w:color w:val="000000"/>
-          <w:sz w:val="24"/>
-          <w:szCs w:val="24"/>
-          <w:lang w:eastAsia="ru-RU"/>
-        </w:rPr>
-        <w:t>) ∙ (1/К</w:t>
-      </w:r>
-      <w:r>
-        <w:rPr>
-          <w:rFonts w:eastAsia="Times New Roman" w:cs="Times New Roman"/>
-          <w:color w:val="000000"/>
-          <w:sz w:val="24"/>
-          <w:szCs w:val="24"/>
-          <w:vertAlign w:val="subscript"/>
-          <w:lang w:eastAsia="ru-RU"/>
-        </w:rPr>
-        <w:t>н</w:t>
-      </w:r>
-      <w:r>
-        <w:rPr>
-          <w:rFonts w:eastAsia="Times New Roman" w:cs="Times New Roman"/>
-          <w:color w:val="000000"/>
-          <w:sz w:val="24"/>
-          <w:szCs w:val="24"/>
-          <w:lang w:eastAsia="ru-RU"/>
-        </w:rPr>
-        <w:t xml:space="preserve">) = </w:t>
-      </w:r>
-      <w:r>
-        <w:rPr>
-          <w:rFonts w:cs="Times New Roman"/>
-          <w:sz w:val="24"/>
-          <w:szCs w:val="24"/>
-        </w:rPr>
-        <w:t>0,514</w:t>
-      </w:r>
-      <w:r>
-        <w:rPr>
-          <w:rFonts w:cs="Times New Roman"/>
-          <w:sz w:val="24"/>
-          <w:szCs w:val="24"/>
-        </w:rPr>
-        <w:t xml:space="preserve"> </w:t>
-      </w:r>
-      <w:r>
-        <w:rPr>
-          <w:rFonts w:eastAsia="Times New Roman" w:cs="Times New Roman"/>
-          <w:color w:val="000000"/>
-          <w:sz w:val="24"/>
-          <w:szCs w:val="24"/>
-          <w:lang w:eastAsia="ru-RU"/>
-        </w:rPr>
-        <w:t>кПа</w:t>
-      </w:r>
-      <w:r>
-        <w:rPr>
-          <w:rFonts w:eastAsia="Times New Roman" w:cs="Times New Roman"/>
-          <w:color w:val="000000"/>
-          <w:sz w:val="24"/>
-          <w:szCs w:val="24"/>
-          <w:lang w:eastAsia="ru-RU"/>
-        </w:rPr>
-        <w:tab/>
-      </w:r>
-    </w:p>
-    <w:p>
-      <w:pPr>
-        <w:contextualSpacing/>
-        <w:rPr>
-          <w:rFonts w:eastAsia="Times New Roman" w:cs="Times New Roman"/>
-          <w:color w:val="000000"/>
-          <w:sz w:val="24"/>
-          <w:szCs w:val="24"/>
-          <w:lang w:eastAsia="ru-RU"/>
-        </w:rPr>
-      </w:pPr>
-    </w:p>
-    <w:p>
-      <w:pPr>
-        <w:contextualSpacing/>
-        <w:rPr>
-          <w:rFonts w:cs="Times New Roman"/>
-          <w:sz w:val="24"/>
-          <w:szCs w:val="24"/>
-        </w:rPr>
-      </w:pPr>
-      <w:r>
-        <w:rPr>
-          <w:rFonts w:eastAsia="Times New Roman" w:cs="Times New Roman"/>
-          <w:color w:val="000000"/>
-          <w:sz w:val="24"/>
-          <w:szCs w:val="24"/>
-          <w:lang w:eastAsia="ru-RU"/>
-        </w:rPr>
-        <w:t>при V</w:t>
-      </w:r>
-      <w:r>
-        <w:rPr>
-          <w:rFonts w:eastAsia="Times New Roman" w:cs="Times New Roman"/>
-          <w:color w:val="000000"/>
-          <w:sz w:val="24"/>
-          <w:szCs w:val="24"/>
-          <w:vertAlign w:val="subscript"/>
-          <w:lang w:eastAsia="ru-RU"/>
-        </w:rPr>
-        <w:t>св</w:t>
-      </w:r>
-      <w:r>
-        <w:rPr>
-          <w:rFonts w:eastAsia="Times New Roman" w:cs="Times New Roman"/>
-          <w:color w:val="000000"/>
-          <w:sz w:val="24"/>
-          <w:szCs w:val="24"/>
-          <w:lang w:eastAsia="ru-RU"/>
-        </w:rPr>
-        <w:t xml:space="preserve"> = 611 м</w:t>
-      </w:r>
-      <w:r>
-        <w:rPr>
-          <w:rFonts w:eastAsia="Times New Roman" w:cs="Times New Roman"/>
-          <w:color w:val="000000"/>
-          <w:sz w:val="24"/>
-          <w:szCs w:val="24"/>
-          <w:vertAlign w:val="superscript"/>
-          <w:lang w:eastAsia="ru-RU"/>
-        </w:rPr>
-        <w:t xml:space="preserve">3 </w:t>
-      </w:r>
-      <w:r>
-        <w:rPr>
-          <w:rFonts w:eastAsia="Times New Roman" w:cs="Times New Roman"/>
-          <w:color w:val="000000"/>
-          <w:sz w:val="24"/>
-          <w:szCs w:val="24"/>
-          <w:lang w:eastAsia="ru-RU"/>
-        </w:rPr>
-        <w:t xml:space="preserve">(размеры помещения </w:t>
-      </w:r>
-      <w:r>
-        <w:rPr>
-          <w:rFonts w:cs="Times New Roman"/>
-          <w:sz w:val="24"/>
-          <w:szCs w:val="24"/>
-        </w:rPr>
-        <w:t xml:space="preserve">12,65х17,25 </w:t>
-      </w:r>
-      <w:r>
-        <w:rPr>
-          <w:rFonts w:eastAsia="Times New Roman" w:cs="Times New Roman"/>
-          <w:color w:val="000000"/>
-          <w:sz w:val="24"/>
-          <w:szCs w:val="24"/>
-          <w:lang w:eastAsia="ru-RU"/>
-        </w:rPr>
-        <w:t>×3,5 с учетом коэффициента заполняемости)</w:t>
-      </w:r>
-    </w:p>
-    <w:p>
-      <w:pPr>
-        <w:contextualSpacing/>
-        <w:rPr>
-          <w:rFonts w:cs="Times New Roman"/>
-          <w:sz w:val="24"/>
-          <w:szCs w:val="24"/>
-        </w:rPr>
-      </w:pPr>
-    </w:p>
-    <w:p>
-      <w:pPr>
-        <w:contextualSpacing/>
-        <w:rPr>
-          <w:rFonts w:cs="Times New Roman"/>
-          <w:sz w:val="24"/>
-          <w:szCs w:val="24"/>
-        </w:rPr>
-      </w:pPr>
-      <w:r>
-        <w:rPr>
-          <w:rFonts w:cs="Times New Roman"/>
-          <w:sz w:val="24"/>
-          <w:szCs w:val="24"/>
-        </w:rPr>
-        <w:t xml:space="preserve">Расчеты воздействий для открытого пространстве не приводятся ввиду незначительности количества газа, поступившего в помещение котельной и небольшой величины воздействия избыточного давления взрыва, равного </w:t>
-      </w:r>
-      <w:r>
-        <w:rPr>
-          <w:rFonts w:eastAsia="Times New Roman" w:cs="Times New Roman"/>
-          <w:color w:val="000000"/>
-          <w:sz w:val="24"/>
-          <w:szCs w:val="24"/>
-          <w:lang w:eastAsia="ru-RU"/>
-        </w:rPr>
-        <w:t xml:space="preserve">0,514 </w:t>
-      </w:r>
-      <w:r>
-        <w:rPr>
-          <w:rFonts w:cs="Times New Roman"/>
-          <w:sz w:val="24"/>
-          <w:szCs w:val="24"/>
-        </w:rPr>
-        <w:t xml:space="preserve">кПа. </w:t>
-      </w:r>
-    </w:p>
-    <w:p>
-      <w:pPr>
-        <w:contextualSpacing/>
-        <w:rPr>
-          <w:rFonts w:cs="Times New Roman"/>
-          <w:sz w:val="24"/>
-          <w:szCs w:val="24"/>
-        </w:rPr>
-      </w:pPr>
-    </w:p>
-    <w:p>
-      <w:pPr>
-        <w:contextualSpacing/>
-        <w:rPr>
-          <w:rFonts w:cs="Times New Roman"/>
-          <w:sz w:val="24"/>
-          <w:szCs w:val="24"/>
-        </w:rPr>
-      </w:pPr>
-      <w:r>
-        <w:rPr>
-          <w:rFonts w:cs="Times New Roman"/>
-          <w:sz w:val="24"/>
-          <w:szCs w:val="24"/>
-        </w:rPr>
-        <w:t>Ситуационный план представлен в приложении №4</w:t>
-      </w:r>
-    </w:p>
-    <w:p>
-      <w:pPr>
-        <w:contextualSpacing/>
-        <w:rPr>
-          <w:rFonts w:cs="Times New Roman"/>
-          <w:sz w:val="24"/>
-          <w:szCs w:val="24"/>
-        </w:rPr>
-      </w:pPr>
-    </w:p>
-    <w:p>
-      <w:pPr>
-        <w:rPr>
-          <w:rFonts w:cs="Times New Roman"/>
-          <w:sz w:val="24"/>
-          <w:szCs w:val="24"/>
-        </w:rPr>
-      </w:pPr>
-      <w:r>
-        <w:rPr>
-          <w:rFonts w:cs="Times New Roman"/>
-          <w:b/>
-          <w:sz w:val="24"/>
-          <w:szCs w:val="24"/>
-        </w:rPr>
-        <w:lastRenderedPageBreak/>
-        <w:t>Выводы</w:t>
-      </w:r>
-      <w:r>
-        <w:rPr>
-          <w:rFonts w:cs="Times New Roman"/>
-          <w:sz w:val="24"/>
-          <w:szCs w:val="24"/>
-        </w:rPr>
-        <w:t xml:space="preserve">. В результате расчета было определено избыточное давление волны взрыва облака газовоздушной смеси в помещении котельной, согласно </w:t>
-      </w:r>
-      <w:r>
-        <w:rPr>
-          <w:rFonts w:cs="Times New Roman"/>
-          <w:sz w:val="24"/>
-          <w:szCs w:val="24"/>
-        </w:rPr>
-        <w:t>методике [22], при данном</w:t>
-      </w:r>
-      <w:r>
-        <w:rPr>
-          <w:rFonts w:cs="Times New Roman"/>
-          <w:sz w:val="24"/>
-          <w:szCs w:val="24"/>
-        </w:rPr>
-        <w:t xml:space="preserve"> избыточном давлении 0,514 кПа здоровью персонала угроз не существует, разрушений кровли, стеновых панелей и остекления здания не произойдет.</w:t>
-      </w:r>
-    </w:p>
-    <w:p>
-      <w:pPr>
-        <w:rPr>
-          <w:rFonts w:cs="Times New Roman"/>
-          <w:sz w:val="24"/>
-          <w:szCs w:val="24"/>
-          <w:highlight w:val="yellow"/>
-        </w:rPr>
-      </w:pPr>
-    </w:p>
-    <w:p>
-      <w:pPr>
-        <w:autoSpaceDE w:val="0"/>
-        <w:ind w:firstLine="708"/>
-        <w:contextualSpacing/>
-        <w:rPr>
-          <w:rFonts w:cs="Times New Roman"/>
-          <w:sz w:val="24"/>
-          <w:szCs w:val="24"/>
-        </w:rPr>
-      </w:pPr>
+      <w:bookmarkStart w:id="0" w:name="_GoBack"/>
+      <w:bookmarkEnd w:id="0"/>
     </w:p>
     <w:sectPr>
       <w:pgSz w:w="16838" w:h="11906" w:orient="landscape"/>

</xml_diff>